<commit_message>
Update English DOCX, add Hebrew DOCX, add DOCX button for Hebrew resume
</commit_message>
<xml_diff>
--- a/PDF/resume-eng.docx
+++ b/PDF/resume-eng.docx
@@ -4,11 +4,11 @@
   <w:body>
     <w:p>
       <w:pPr>
-        <w:spacing w:after="40"/>
-        <w:jc w:val="center"/>
+        <w:spacing w:before="0" w:after="40"/>
       </w:pPr>
       <w:r>
         <w:rPr>
+          <w:rFonts w:ascii="Segoe UI" w:hAnsi="Segoe UI"/>
           <w:b/>
           <w:i w:val="0"/>
           <w:color w:val="0F172A"/>
@@ -19,46 +19,250 @@
     </w:p>
     <w:p>
       <w:pPr>
-        <w:spacing w:after="40"/>
-        <w:jc w:val="center"/>
+        <w:spacing w:before="0" w:after="120"/>
       </w:pPr>
       <w:r>
         <w:rPr>
-          <w:b/>
-          <w:i w:val="0"/>
-          <w:color w:val="4F46E5"/>
-          <w:sz w:val="24"/>
-        </w:rPr>
-        <w:t>DevOps Engineer</w:t>
-      </w:r>
-    </w:p>
-    <w:p>
-      <w:pPr>
-        <w:spacing w:after="120"/>
-        <w:jc w:val="center"/>
-      </w:pPr>
-      <w:r>
-        <w:rPr>
+          <w:rFonts w:ascii="Segoe UI" w:hAnsi="Segoe UI"/>
           <w:b w:val="0"/>
           <w:i w:val="0"/>
           <w:color w:val="64748B"/>
           <w:sz w:val="18"/>
         </w:rPr>
-        <w:t>054-5433696  ·  mathewguralskiy@gmail.com  ·  matveyguralskiy.com  ·  github.com/MatveyGuralskiy  ·  Israel</w:t>
+        <w:t>DevOps Engineer  ·  054-5433696  ·  mathewguralskiy@gmail.com  ·  matveyguralskiy.com  ·  github.com/MatveyGuralskiy  ·  Israel</w:t>
       </w:r>
     </w:p>
     <w:p>
       <w:pPr>
-        <w:spacing w:before="160" w:after="40"/>
+        <w:spacing w:before="200" w:after="60"/>
         <w:pBdr>
-          <w:bottom w:val="single" w:sz="6" w:space="1" w:color="4F46E5"/>
+          <w:bottom w:val="single" w:sz="6" w:space="4" w:color="818CF8"/>
         </w:pBdr>
       </w:pPr>
       <w:r>
         <w:rPr>
+          <w:rFonts w:ascii="Segoe UI" w:hAnsi="Segoe UI"/>
           <w:b/>
           <w:i w:val="0"/>
-          <w:color w:val="4F46E5"/>
+          <w:color w:val="818CF8"/>
+          <w:sz w:val="20"/>
+        </w:rPr>
+        <w:t>SKILLS</w:t>
+      </w:r>
+    </w:p>
+    <w:p>
+      <w:pPr>
+        <w:spacing w:before="40" w:after="20"/>
+      </w:pPr>
+      <w:r>
+        <w:rPr>
+          <w:rFonts w:ascii="Segoe UI" w:hAnsi="Segoe UI"/>
+          <w:b/>
+          <w:i w:val="0"/>
+          <w:color w:val="64748B"/>
+          <w:sz w:val="18"/>
+        </w:rPr>
+        <w:t xml:space="preserve">Cloud: </w:t>
+      </w:r>
+      <w:r>
+        <w:rPr>
+          <w:rFonts w:ascii="Segoe UI" w:hAnsi="Segoe UI"/>
+          <w:b w:val="0"/>
+          <w:i w:val="0"/>
+          <w:color w:val="C7D2FE"/>
+          <w:sz w:val="18"/>
+        </w:rPr>
+        <w:t>AWS · GCP · Azure</w:t>
+      </w:r>
+    </w:p>
+    <w:p>
+      <w:pPr>
+        <w:spacing w:before="40" w:after="20"/>
+      </w:pPr>
+      <w:r>
+        <w:rPr>
+          <w:rFonts w:ascii="Segoe UI" w:hAnsi="Segoe UI"/>
+          <w:b/>
+          <w:i w:val="0"/>
+          <w:color w:val="64748B"/>
+          <w:sz w:val="18"/>
+        </w:rPr>
+        <w:t xml:space="preserve">IaC &amp; Config: </w:t>
+      </w:r>
+      <w:r>
+        <w:rPr>
+          <w:rFonts w:ascii="Segoe UI" w:hAnsi="Segoe UI"/>
+          <w:b w:val="0"/>
+          <w:i w:val="0"/>
+          <w:color w:val="C7D2FE"/>
+          <w:sz w:val="18"/>
+        </w:rPr>
+        <w:t>Terraform · Terragrunt · Ansible · Helm</w:t>
+      </w:r>
+    </w:p>
+    <w:p>
+      <w:pPr>
+        <w:spacing w:before="40" w:after="20"/>
+      </w:pPr>
+      <w:r>
+        <w:rPr>
+          <w:rFonts w:ascii="Segoe UI" w:hAnsi="Segoe UI"/>
+          <w:b/>
+          <w:i w:val="0"/>
+          <w:color w:val="64748B"/>
+          <w:sz w:val="18"/>
+        </w:rPr>
+        <w:t xml:space="preserve">Containers: </w:t>
+      </w:r>
+      <w:r>
+        <w:rPr>
+          <w:rFonts w:ascii="Segoe UI" w:hAnsi="Segoe UI"/>
+          <w:b w:val="0"/>
+          <w:i w:val="0"/>
+          <w:color w:val="C7D2FE"/>
+          <w:sz w:val="18"/>
+        </w:rPr>
+        <w:t>Kubernetes · Docker · ArgoCD · ECS · ECR · EKS</w:t>
+      </w:r>
+    </w:p>
+    <w:p>
+      <w:pPr>
+        <w:spacing w:before="40" w:after="20"/>
+      </w:pPr>
+      <w:r>
+        <w:rPr>
+          <w:rFonts w:ascii="Segoe UI" w:hAnsi="Segoe UI"/>
+          <w:b/>
+          <w:i w:val="0"/>
+          <w:color w:val="64748B"/>
+          <w:sz w:val="18"/>
+        </w:rPr>
+        <w:t xml:space="preserve">CI/CD: </w:t>
+      </w:r>
+      <w:r>
+        <w:rPr>
+          <w:rFonts w:ascii="Segoe UI" w:hAnsi="Segoe UI"/>
+          <w:b w:val="0"/>
+          <w:i w:val="0"/>
+          <w:color w:val="C7D2FE"/>
+          <w:sz w:val="18"/>
+        </w:rPr>
+        <w:t>Jenkins · GitHub Actions · GitLab CI · Bitbucket · Azure DevOps</w:t>
+      </w:r>
+    </w:p>
+    <w:p>
+      <w:pPr>
+        <w:spacing w:before="40" w:after="20"/>
+      </w:pPr>
+      <w:r>
+        <w:rPr>
+          <w:rFonts w:ascii="Segoe UI" w:hAnsi="Segoe UI"/>
+          <w:b/>
+          <w:i w:val="0"/>
+          <w:color w:val="64748B"/>
+          <w:sz w:val="18"/>
+        </w:rPr>
+        <w:t xml:space="preserve">Observability: </w:t>
+      </w:r>
+      <w:r>
+        <w:rPr>
+          <w:rFonts w:ascii="Segoe UI" w:hAnsi="Segoe UI"/>
+          <w:b w:val="0"/>
+          <w:i w:val="0"/>
+          <w:color w:val="C7D2FE"/>
+          <w:sz w:val="18"/>
+        </w:rPr>
+        <w:t>Prometheus · Grafana · Fluentd</w:t>
+      </w:r>
+    </w:p>
+    <w:p>
+      <w:pPr>
+        <w:spacing w:before="40" w:after="20"/>
+      </w:pPr>
+      <w:r>
+        <w:rPr>
+          <w:rFonts w:ascii="Segoe UI" w:hAnsi="Segoe UI"/>
+          <w:b/>
+          <w:i w:val="0"/>
+          <w:color w:val="64748B"/>
+          <w:sz w:val="18"/>
+        </w:rPr>
+        <w:t xml:space="preserve">Platform Automation: </w:t>
+      </w:r>
+      <w:r>
+        <w:rPr>
+          <w:rFonts w:ascii="Segoe UI" w:hAnsi="Segoe UI"/>
+          <w:b w:val="0"/>
+          <w:i w:val="0"/>
+          <w:color w:val="C7D2FE"/>
+          <w:sz w:val="18"/>
+        </w:rPr>
+        <w:t>Torque (Quali)</w:t>
+      </w:r>
+    </w:p>
+    <w:p>
+      <w:pPr>
+        <w:spacing w:before="40" w:after="20"/>
+      </w:pPr>
+      <w:r>
+        <w:rPr>
+          <w:rFonts w:ascii="Segoe UI" w:hAnsi="Segoe UI"/>
+          <w:b/>
+          <w:i w:val="0"/>
+          <w:color w:val="64748B"/>
+          <w:sz w:val="18"/>
+        </w:rPr>
+        <w:t xml:space="preserve">Development: </w:t>
+      </w:r>
+      <w:r>
+        <w:rPr>
+          <w:rFonts w:ascii="Segoe UI" w:hAnsi="Segoe UI"/>
+          <w:b w:val="0"/>
+          <w:i w:val="0"/>
+          <w:color w:val="C7D2FE"/>
+          <w:sz w:val="18"/>
+        </w:rPr>
+        <w:t>Python · Bash · Flutter · Flask · SQL</w:t>
+      </w:r>
+    </w:p>
+    <w:p>
+      <w:pPr>
+        <w:spacing w:before="40" w:after="20"/>
+      </w:pPr>
+      <w:r>
+        <w:rPr>
+          <w:rFonts w:ascii="Segoe UI" w:hAnsi="Segoe UI"/>
+          <w:b/>
+          <w:i w:val="0"/>
+          <w:color w:val="64748B"/>
+          <w:sz w:val="18"/>
+        </w:rPr>
+        <w:t xml:space="preserve">AI &amp; Automation: </w:t>
+      </w:r>
+      <w:r>
+        <w:rPr>
+          <w:rFonts w:ascii="Segoe UI" w:hAnsi="Segoe UI"/>
+          <w:b w:val="0"/>
+          <w:i w:val="0"/>
+          <w:color w:val="C7D2FE"/>
+          <w:sz w:val="18"/>
+        </w:rPr>
+        <w:t>Gemini AI · Claude Code · Cursor AI · AWS Bedrock</w:t>
+      </w:r>
+    </w:p>
+    <w:p>
+      <w:pPr>
+        <w:spacing w:before="200" w:after="60"/>
+        <w:pBdr>
+          <w:bottom w:val="single" w:sz="6" w:space="4" w:color="818CF8"/>
+        </w:pBdr>
+      </w:pPr>
+      <w:r>
+        <w:rPr>
+          <w:rFonts w:ascii="Segoe UI" w:hAnsi="Segoe UI"/>
+          <w:b/>
+          <w:i w:val="0"/>
+          <w:color w:val="818CF8"/>
           <w:sz w:val="20"/>
         </w:rPr>
         <w:t>SUMMARY</w:t>
@@ -66,386 +270,35 @@
     </w:p>
     <w:p>
       <w:pPr>
-        <w:spacing w:after="40"/>
+        <w:spacing w:before="60" w:after="60"/>
       </w:pPr>
       <w:r>
         <w:rPr>
+          <w:rFonts w:ascii="Segoe UI" w:hAnsi="Segoe UI"/>
           <w:b w:val="0"/>
           <w:i w:val="0"/>
           <w:color w:val="334155"/>
           <w:sz w:val="19"/>
         </w:rPr>
-        <w:t>DevOps Engineer with 1.5+ years of experience modernizing cloud infrastructure on AWS and GCP for enterprise clients including Bank Hapoalim, ICL, Ministry of Justice, Ministry of Transport, and Mapi. Skilled in full-cycle CI/CD, GitOps, IaC, and AI-driven automation. Holds 10 cloud certifications including AWS and GCP Professional levels. Also a solo founder of two live Flutter apps on iOS and Android with serverless AWS backends.</w:t>
+        <w:t>DevOps Engineer specializing in cloud infrastructure on AWS and GCP for enterprise clients. Skilled in full-cycle CI/CD, GitOps, IaC, and AI-driven automation. Holds 10 cloud certifications including AWS and GCP Professional levels.</w:t>
       </w:r>
     </w:p>
     <w:p>
       <w:pPr>
-        <w:spacing w:before="160" w:after="40"/>
+        <w:spacing w:before="200" w:after="60"/>
         <w:pBdr>
-          <w:bottom w:val="single" w:sz="6" w:space="1" w:color="4F46E5"/>
+          <w:bottom w:val="single" w:sz="6" w:space="4" w:color="818CF8"/>
         </w:pBdr>
       </w:pPr>
       <w:r>
         <w:rPr>
+          <w:rFonts w:ascii="Segoe UI" w:hAnsi="Segoe UI"/>
           <w:b/>
           <w:i w:val="0"/>
-          <w:color w:val="4F46E5"/>
-          <w:sz w:val="20"/>
-        </w:rPr>
-        <w:t>SKILLS</w:t>
-      </w:r>
-    </w:p>
-    <w:p>
-      <w:pPr>
-        <w:spacing w:after="20" w:before="0"/>
-      </w:pPr>
-      <w:r>
-        <w:rPr>
-          <w:b/>
-          <w:i w:val="0"/>
-          <w:color w:val="0F172A"/>
-          <w:sz w:val="19"/>
-        </w:rPr>
-        <w:t xml:space="preserve">Cloud: </w:t>
-      </w:r>
-      <w:r>
-        <w:rPr>
-          <w:b w:val="0"/>
-          <w:i w:val="0"/>
-          <w:color w:val="334155"/>
-          <w:sz w:val="19"/>
-        </w:rPr>
-        <w:t>AWS · GCP</w:t>
-      </w:r>
-    </w:p>
-    <w:p>
-      <w:pPr>
-        <w:spacing w:after="20" w:before="0"/>
-      </w:pPr>
-      <w:r>
-        <w:rPr>
-          <w:b/>
-          <w:i w:val="0"/>
-          <w:color w:val="0F172A"/>
-          <w:sz w:val="19"/>
-        </w:rPr>
-        <w:t xml:space="preserve">IaC &amp; Config: </w:t>
-      </w:r>
-      <w:r>
-        <w:rPr>
-          <w:b w:val="0"/>
-          <w:i w:val="0"/>
-          <w:color w:val="334155"/>
-          <w:sz w:val="19"/>
-        </w:rPr>
-        <w:t>Terraform · Terragrunt · Ansible · Helm</w:t>
-      </w:r>
-    </w:p>
-    <w:p>
-      <w:pPr>
-        <w:spacing w:after="20" w:before="0"/>
-      </w:pPr>
-      <w:r>
-        <w:rPr>
-          <w:b/>
-          <w:i w:val="0"/>
-          <w:color w:val="0F172A"/>
-          <w:sz w:val="19"/>
-        </w:rPr>
-        <w:t xml:space="preserve">Containers &amp; Orchestration: </w:t>
-      </w:r>
-      <w:r>
-        <w:rPr>
-          <w:b w:val="0"/>
-          <w:i w:val="0"/>
-          <w:color w:val="334155"/>
-          <w:sz w:val="19"/>
-        </w:rPr>
-        <w:t>Kubernetes · Docker · ArgoCD · ECS · ECR · EKS</w:t>
-      </w:r>
-    </w:p>
-    <w:p>
-      <w:pPr>
-        <w:spacing w:after="20" w:before="0"/>
-      </w:pPr>
-      <w:r>
-        <w:rPr>
-          <w:b/>
-          <w:i w:val="0"/>
-          <w:color w:val="0F172A"/>
-          <w:sz w:val="19"/>
-        </w:rPr>
-        <w:t xml:space="preserve">CI/CD: </w:t>
-      </w:r>
-      <w:r>
-        <w:rPr>
-          <w:b w:val="0"/>
-          <w:i w:val="0"/>
-          <w:color w:val="334155"/>
-          <w:sz w:val="19"/>
-        </w:rPr>
-        <w:t>Jenkins · GitHub Actions · GitLab CI · Bitbucket · Azure DevOps</w:t>
-      </w:r>
-    </w:p>
-    <w:p>
-      <w:pPr>
-        <w:spacing w:after="20" w:before="0"/>
-      </w:pPr>
-      <w:r>
-        <w:rPr>
-          <w:b/>
-          <w:i w:val="0"/>
-          <w:color w:val="0F172A"/>
-          <w:sz w:val="19"/>
-        </w:rPr>
-        <w:t xml:space="preserve">Observability: </w:t>
-      </w:r>
-      <w:r>
-        <w:rPr>
-          <w:b w:val="0"/>
-          <w:i w:val="0"/>
-          <w:color w:val="334155"/>
-          <w:sz w:val="19"/>
-        </w:rPr>
-        <w:t>Prometheus · Grafana · Fluentd</w:t>
-      </w:r>
-    </w:p>
-    <w:p>
-      <w:pPr>
-        <w:spacing w:after="20" w:before="0"/>
-      </w:pPr>
-      <w:r>
-        <w:rPr>
-          <w:b/>
-          <w:i w:val="0"/>
-          <w:color w:val="0F172A"/>
-          <w:sz w:val="19"/>
-        </w:rPr>
-        <w:t xml:space="preserve">Lab Automation: </w:t>
-      </w:r>
-      <w:r>
-        <w:rPr>
-          <w:b w:val="0"/>
-          <w:i w:val="0"/>
-          <w:color w:val="334155"/>
-          <w:sz w:val="19"/>
-        </w:rPr>
-        <w:t>Torque (Quali)</w:t>
-      </w:r>
-    </w:p>
-    <w:p>
-      <w:pPr>
-        <w:spacing w:after="20" w:before="0"/>
-      </w:pPr>
-      <w:r>
-        <w:rPr>
-          <w:b/>
-          <w:i w:val="0"/>
-          <w:color w:val="0F172A"/>
-          <w:sz w:val="19"/>
-        </w:rPr>
-        <w:t xml:space="preserve">Development: </w:t>
-      </w:r>
-      <w:r>
-        <w:rPr>
-          <w:b w:val="0"/>
-          <w:i w:val="0"/>
-          <w:color w:val="334155"/>
-          <w:sz w:val="19"/>
-        </w:rPr>
-        <w:t>Python · Bash · Flutter · Flask · SQL</w:t>
-      </w:r>
-    </w:p>
-    <w:p>
-      <w:pPr>
-        <w:spacing w:after="20" w:before="0"/>
-      </w:pPr>
-      <w:r>
-        <w:rPr>
-          <w:b/>
-          <w:i w:val="0"/>
-          <w:color w:val="0F172A"/>
-          <w:sz w:val="19"/>
-        </w:rPr>
-        <w:t xml:space="preserve">AI &amp; Automation: </w:t>
-      </w:r>
-      <w:r>
-        <w:rPr>
-          <w:b w:val="0"/>
-          <w:i w:val="0"/>
-          <w:color w:val="334155"/>
-          <w:sz w:val="19"/>
-        </w:rPr>
-        <w:t>Gemini AI · Claude Code · Cursor AI · AWS Bedrock</w:t>
-      </w:r>
-    </w:p>
-    <w:p>
-      <w:pPr>
-        <w:spacing w:before="160" w:after="40"/>
-        <w:pBdr>
-          <w:bottom w:val="single" w:sz="6" w:space="1" w:color="4F46E5"/>
-        </w:pBdr>
-      </w:pPr>
-      <w:r>
-        <w:rPr>
-          <w:b/>
-          <w:i w:val="0"/>
-          <w:color w:val="4F46E5"/>
+          <w:color w:val="818CF8"/>
           <w:sz w:val="20"/>
         </w:rPr>
         <w:t>EXPERIENCE</w:t>
-      </w:r>
-    </w:p>
-    <w:p>
-      <w:pPr>
-        <w:spacing w:after="20"/>
-      </w:pPr>
-      <w:r>
-        <w:rPr>
-          <w:b/>
-          <w:i w:val="0"/>
-          <w:color w:val="0F172A"/>
-          <w:sz w:val="22"/>
-        </w:rPr>
-        <w:t>DevOps Engineer</w:t>
-      </w:r>
-      <w:r>
-        <w:rPr>
-          <w:b w:val="0"/>
-          <w:i w:val="0"/>
-          <w:color w:val="64748B"/>
-          <w:sz w:val="18"/>
-        </w:rPr>
-        <w:t xml:space="preserve">  ·  Sep 2025 — Present</w:t>
-      </w:r>
-    </w:p>
-    <w:p>
-      <w:pPr>
-        <w:spacing w:after="60"/>
-      </w:pPr>
-      <w:r>
-        <w:rPr>
-          <w:b/>
-          <w:i w:val="0"/>
-          <w:color w:val="4F46E5"/>
-          <w:sz w:val="19"/>
-        </w:rPr>
-        <w:t>Compie Technologies · Ramat Gan, Israel · Hybrid</w:t>
-      </w:r>
-    </w:p>
-    <w:p>
-      <w:pPr>
-        <w:pStyle w:val="ListBullet"/>
-        <w:spacing w:after="20" w:before="0"/>
-        <w:ind w:left="227"/>
-      </w:pPr>
-      <w:r>
-        <w:rPr>
-          <w:b/>
-          <w:i w:val="0"/>
-          <w:sz w:val="19"/>
-        </w:rPr>
-        <w:t xml:space="preserve">Bank Hapoalim — </w:t>
-      </w:r>
-      <w:r>
-        <w:rPr>
-          <w:b w:val="0"/>
-          <w:i w:val="0"/>
-          <w:sz w:val="19"/>
-        </w:rPr>
-        <w:t>Platform team: Torque (Quali) environment automation, GitLab CI pipelines, EKS cluster management and infrastructure automations.</w:t>
-      </w:r>
-    </w:p>
-    <w:p>
-      <w:pPr>
-        <w:pStyle w:val="ListBullet"/>
-        <w:spacing w:after="20" w:before="0"/>
-        <w:ind w:left="227"/>
-      </w:pPr>
-      <w:r>
-        <w:rPr>
-          <w:b/>
-          <w:i w:val="0"/>
-          <w:sz w:val="19"/>
-        </w:rPr>
-        <w:t xml:space="preserve">Mapi — </w:t>
-      </w:r>
-      <w:r>
-        <w:rPr>
-          <w:b w:val="0"/>
-          <w:i w:val="0"/>
-          <w:sz w:val="19"/>
-        </w:rPr>
-        <w:t>Landing Zone architecture: Central API Gateway, Shared Core Endpoints, Central S3 with STS-based cross-account access, multi-account AWS setup with Terraform.</w:t>
-      </w:r>
-    </w:p>
-    <w:p>
-      <w:pPr>
-        <w:pStyle w:val="ListBullet"/>
-        <w:spacing w:after="20" w:before="0"/>
-        <w:ind w:left="227"/>
-      </w:pPr>
-      <w:r>
-        <w:rPr>
-          <w:b/>
-          <w:i w:val="0"/>
-          <w:sz w:val="19"/>
-        </w:rPr>
-        <w:t xml:space="preserve">Topocad — </w:t>
-      </w:r>
-      <w:r>
-        <w:rPr>
-          <w:b w:val="0"/>
-          <w:i w:val="0"/>
-          <w:sz w:val="19"/>
-        </w:rPr>
-        <w:t>GIS platform on AWS: full infrastructure with Terraform, Bitbucket Pipelines CI/CD, ECS microservices deployment and orchestration.</w:t>
-      </w:r>
-    </w:p>
-    <w:p>
-      <w:pPr>
-        <w:pStyle w:val="ListBullet"/>
-        <w:spacing w:after="20" w:before="0"/>
-        <w:ind w:left="227"/>
-      </w:pPr>
-      <w:r>
-        <w:rPr>
-          <w:b/>
-          <w:i w:val="0"/>
-          <w:sz w:val="19"/>
-        </w:rPr>
-        <w:t xml:space="preserve">Ministry of Transport — </w:t>
-      </w:r>
-      <w:r>
-        <w:rPr>
-          <w:b w:val="0"/>
-          <w:i w:val="0"/>
-          <w:sz w:val="19"/>
-        </w:rPr>
-        <w:t>Maslulan (Moovit-like web app): end-to-end infrastructure deployment, centralized logging, monitoring stack, and full CI/CD pipelines.</w:t>
-      </w:r>
-    </w:p>
-    <w:p>
-      <w:pPr>
-        <w:pStyle w:val="ListBullet"/>
-        <w:spacing w:after="20" w:before="0"/>
-        <w:ind w:left="227"/>
-      </w:pPr>
-      <w:r>
-        <w:rPr>
-          <w:b/>
-          <w:i w:val="0"/>
-          <w:sz w:val="19"/>
-        </w:rPr>
-        <w:t xml:space="preserve">Ministry of Justice — </w:t>
-      </w:r>
-      <w:r>
-        <w:rPr>
-          <w:b w:val="0"/>
-          <w:i w:val="0"/>
-          <w:sz w:val="19"/>
-        </w:rPr>
-        <w:t>Platform automations using Torque (Quali) and Terraform for environment provisioning and governance workflows.</w:t>
       </w:r>
     </w:p>
     <w:p>
@@ -454,33 +307,258 @@
       </w:pPr>
       <w:r>
         <w:rPr>
+          <w:rFonts w:ascii="Segoe UI" w:hAnsi="Segoe UI"/>
           <w:b/>
           <w:i w:val="0"/>
           <w:color w:val="0F172A"/>
-          <w:sz w:val="22"/>
+          <w:sz w:val="21"/>
         </w:rPr>
         <w:t>DevOps Engineer</w:t>
       </w:r>
       <w:r>
         <w:rPr>
+          <w:rFonts w:ascii="Segoe UI" w:hAnsi="Segoe UI"/>
           <w:b w:val="0"/>
           <w:i w:val="0"/>
           <w:color w:val="64748B"/>
           <w:sz w:val="18"/>
         </w:rPr>
-        <w:t xml:space="preserve">  ·  Sep 2024 — Sep 2025</w:t>
+        <w:t xml:space="preserve">  ·  </w:t>
+      </w:r>
+      <w:r>
+        <w:rPr>
+          <w:rFonts w:ascii="Segoe UI" w:hAnsi="Segoe UI"/>
+          <w:b w:val="0"/>
+          <w:i w:val="0"/>
+          <w:color w:val="64748B"/>
+          <w:sz w:val="18"/>
+        </w:rPr>
+        <w:t>Sep 2025 — Present</w:t>
       </w:r>
     </w:p>
     <w:p>
       <w:pPr>
-        <w:spacing w:after="60"/>
+        <w:spacing w:before="0" w:after="40"/>
       </w:pPr>
       <w:r>
         <w:rPr>
+          <w:rFonts w:ascii="Segoe UI" w:hAnsi="Segoe UI"/>
+          <w:b w:val="0"/>
+          <w:i w:val="0"/>
+          <w:color w:val="818CF8"/>
+          <w:sz w:val="18"/>
+        </w:rPr>
+        <w:t>Compie Technologies · Ramat Gan, Israel · Hybrid</w:t>
+      </w:r>
+    </w:p>
+    <w:p>
+      <w:pPr>
+        <w:pStyle w:val="ListBullet"/>
+        <w:spacing w:before="20" w:after="20"/>
+        <w:ind w:left="227"/>
+      </w:pPr>
+      <w:r>
+        <w:rPr>
+          <w:rFonts w:ascii="Segoe UI" w:hAnsi="Segoe UI"/>
           <w:b/>
           <w:i w:val="0"/>
-          <w:color w:val="4F46E5"/>
+          <w:color w:val="334155"/>
           <w:sz w:val="19"/>
+        </w:rPr>
+        <w:t>Bank Hapoalim</w:t>
+      </w:r>
+      <w:r>
+        <w:rPr>
+          <w:rFonts w:ascii="Segoe UI" w:hAnsi="Segoe UI"/>
+          <w:b w:val="0"/>
+          <w:i w:val="0"/>
+          <w:color w:val="334155"/>
+          <w:sz w:val="19"/>
+        </w:rPr>
+        <w:t xml:space="preserve"> — Platform team: Torque (Quali) automation, GitLab CI pipelines, EKS cluster management and infrastructure automations.</w:t>
+      </w:r>
+    </w:p>
+    <w:p>
+      <w:pPr>
+        <w:pStyle w:val="ListBullet"/>
+        <w:spacing w:before="20" w:after="20"/>
+        <w:ind w:left="227"/>
+      </w:pPr>
+      <w:r>
+        <w:rPr>
+          <w:rFonts w:ascii="Segoe UI" w:hAnsi="Segoe UI"/>
+          <w:b/>
+          <w:i w:val="0"/>
+          <w:color w:val="334155"/>
+          <w:sz w:val="19"/>
+        </w:rPr>
+        <w:t>Mapi</w:t>
+      </w:r>
+      <w:r>
+        <w:rPr>
+          <w:rFonts w:ascii="Segoe UI" w:hAnsi="Segoe UI"/>
+          <w:b w:val="0"/>
+          <w:i w:val="0"/>
+          <w:color w:val="334155"/>
+          <w:sz w:val="19"/>
+        </w:rPr>
+        <w:t xml:space="preserve"> — Landing Zone: Central API Gateway, Shared Core Endpoints, Central S3 with STS, multi-account AWS with Terraform.</w:t>
+      </w:r>
+    </w:p>
+    <w:p>
+      <w:pPr>
+        <w:pStyle w:val="ListBullet"/>
+        <w:spacing w:before="20" w:after="20"/>
+        <w:ind w:left="227"/>
+      </w:pPr>
+      <w:r>
+        <w:rPr>
+          <w:rFonts w:ascii="Segoe UI" w:hAnsi="Segoe UI"/>
+          <w:b/>
+          <w:i w:val="0"/>
+          <w:color w:val="334155"/>
+          <w:sz w:val="19"/>
+        </w:rPr>
+        <w:t>Topocad</w:t>
+      </w:r>
+      <w:r>
+        <w:rPr>
+          <w:rFonts w:ascii="Segoe UI" w:hAnsi="Segoe UI"/>
+          <w:b w:val="0"/>
+          <w:i w:val="0"/>
+          <w:color w:val="334155"/>
+          <w:sz w:val="19"/>
+        </w:rPr>
+        <w:t xml:space="preserve"> — GIS platform on AWS: full infrastructure with Terraform, Bitbucket Pipelines CI/CD, ECS microservices deployment.</w:t>
+      </w:r>
+    </w:p>
+    <w:p>
+      <w:pPr>
+        <w:pStyle w:val="ListBullet"/>
+        <w:spacing w:before="20" w:after="20"/>
+        <w:ind w:left="227"/>
+      </w:pPr>
+      <w:r>
+        <w:rPr>
+          <w:rFonts w:ascii="Segoe UI" w:hAnsi="Segoe UI"/>
+          <w:b/>
+          <w:i w:val="0"/>
+          <w:color w:val="334155"/>
+          <w:sz w:val="19"/>
+        </w:rPr>
+        <w:t>Ministry of Transport</w:t>
+      </w:r>
+      <w:r>
+        <w:rPr>
+          <w:rFonts w:ascii="Segoe UI" w:hAnsi="Segoe UI"/>
+          <w:b w:val="0"/>
+          <w:i w:val="0"/>
+          <w:color w:val="334155"/>
+          <w:sz w:val="19"/>
+        </w:rPr>
+        <w:t xml:space="preserve"> — Maslulan (Moovit-like app): end-to-end infra, centralized logging, monitoring and full CI/CD.</w:t>
+      </w:r>
+    </w:p>
+    <w:p>
+      <w:pPr>
+        <w:pStyle w:val="ListBullet"/>
+        <w:spacing w:before="20" w:after="20"/>
+        <w:ind w:left="227"/>
+      </w:pPr>
+      <w:r>
+        <w:rPr>
+          <w:rFonts w:ascii="Segoe UI" w:hAnsi="Segoe UI"/>
+          <w:b/>
+          <w:i w:val="0"/>
+          <w:color w:val="334155"/>
+          <w:sz w:val="19"/>
+        </w:rPr>
+        <w:t>Ministry of Justice</w:t>
+      </w:r>
+      <w:r>
+        <w:rPr>
+          <w:rFonts w:ascii="Segoe UI" w:hAnsi="Segoe UI"/>
+          <w:b w:val="0"/>
+          <w:i w:val="0"/>
+          <w:color w:val="334155"/>
+          <w:sz w:val="19"/>
+        </w:rPr>
+        <w:t xml:space="preserve"> — Platform automations with Torque (Quali) and Terraform for environment provisioning and governance.</w:t>
+      </w:r>
+    </w:p>
+    <w:p>
+      <w:pPr>
+        <w:pStyle w:val="ListBullet"/>
+        <w:spacing w:before="20" w:after="20"/>
+        <w:ind w:left="227"/>
+      </w:pPr>
+      <w:r>
+        <w:rPr>
+          <w:rFonts w:ascii="Segoe UI" w:hAnsi="Segoe UI"/>
+          <w:b/>
+          <w:i w:val="0"/>
+          <w:color w:val="334155"/>
+          <w:sz w:val="19"/>
+        </w:rPr>
+        <w:t>Israel Aerospace Industries (IAI)</w:t>
+      </w:r>
+      <w:r>
+        <w:rPr>
+          <w:rFonts w:ascii="Segoe UI" w:hAnsi="Segoe UI"/>
+          <w:b w:val="0"/>
+          <w:i w:val="0"/>
+          <w:color w:val="334155"/>
+          <w:sz w:val="19"/>
+        </w:rPr>
+        <w:t xml:space="preserve"> — Lifted the entire main WordPress site from scratch using Terraform and GitHub, including cloud infrastructure, networking, storage, and full deployment.</w:t>
+      </w:r>
+    </w:p>
+    <w:p>
+      <w:pPr>
+        <w:spacing w:before="120" w:after="20"/>
+      </w:pPr>
+      <w:r>
+        <w:rPr>
+          <w:rFonts w:ascii="Segoe UI" w:hAnsi="Segoe UI"/>
+          <w:b/>
+          <w:i w:val="0"/>
+          <w:color w:val="0F172A"/>
+          <w:sz w:val="21"/>
+        </w:rPr>
+        <w:t>DevOps Engineer</w:t>
+      </w:r>
+      <w:r>
+        <w:rPr>
+          <w:rFonts w:ascii="Segoe UI" w:hAnsi="Segoe UI"/>
+          <w:b w:val="0"/>
+          <w:i w:val="0"/>
+          <w:color w:val="64748B"/>
+          <w:sz w:val="18"/>
+        </w:rPr>
+        <w:t xml:space="preserve">  ·  </w:t>
+      </w:r>
+      <w:r>
+        <w:rPr>
+          <w:rFonts w:ascii="Segoe UI" w:hAnsi="Segoe UI"/>
+          <w:b w:val="0"/>
+          <w:i w:val="0"/>
+          <w:color w:val="64748B"/>
+          <w:sz w:val="18"/>
+        </w:rPr>
+        <w:t>2024 — 2025</w:t>
+      </w:r>
+    </w:p>
+    <w:p>
+      <w:pPr>
+        <w:spacing w:before="0" w:after="40"/>
+      </w:pPr>
+      <w:r>
+        <w:rPr>
+          <w:rFonts w:ascii="Segoe UI" w:hAnsi="Segoe UI"/>
+          <w:b w:val="0"/>
+          <w:i w:val="0"/>
+          <w:color w:val="818CF8"/>
+          <w:sz w:val="18"/>
         </w:rPr>
         <w:t>Ness Technology · Ra'anana, Israel</w:t>
       </w:r>
@@ -488,98 +566,147 @@
     <w:p>
       <w:pPr>
         <w:pStyle w:val="ListBullet"/>
-        <w:spacing w:after="20" w:before="0"/>
+        <w:spacing w:before="20" w:after="20"/>
         <w:ind w:left="227"/>
       </w:pPr>
       <w:r>
         <w:rPr>
+          <w:rFonts w:ascii="Segoe UI" w:hAnsi="Segoe UI"/>
           <w:b/>
           <w:i w:val="0"/>
+          <w:color w:val="334155"/>
           <w:sz w:val="19"/>
         </w:rPr>
-        <w:t xml:space="preserve">Shikun Binui — </w:t>
+        <w:t>Shikun Binui</w:t>
       </w:r>
       <w:r>
         <w:rPr>
+          <w:rFonts w:ascii="Segoe UI" w:hAnsi="Segoe UI"/>
           <w:b w:val="0"/>
           <w:i w:val="0"/>
+          <w:color w:val="334155"/>
           <w:sz w:val="19"/>
         </w:rPr>
-        <w:t>Cloud architecture from scratch on AWS — designed and provisioned full infrastructure with Terraform and GitHub Actions CI/CD.</w:t>
+        <w:t xml:space="preserve"> — Designed cloud architecture from scratch on AWS, provisioned full infrastructure with Terraform and GitHub Actions CI/CD.</w:t>
       </w:r>
     </w:p>
     <w:p>
       <w:pPr>
         <w:pStyle w:val="ListBullet"/>
-        <w:spacing w:after="20" w:before="0"/>
+        <w:spacing w:before="20" w:after="20"/>
         <w:ind w:left="227"/>
       </w:pPr>
       <w:r>
         <w:rPr>
+          <w:rFonts w:ascii="Segoe UI" w:hAnsi="Segoe UI"/>
           <w:b w:val="0"/>
           <w:i w:val="0"/>
+          <w:color w:val="334155"/>
           <w:sz w:val="19"/>
         </w:rPr>
-        <w:t>Managed and enforced AWS Service Control Policies (SCP) across multi-account organization for governance and security compliance.</w:t>
+      </w:r>
+      <w:r>
+        <w:rPr>
+          <w:rFonts w:ascii="Segoe UI" w:hAnsi="Segoe UI"/>
+          <w:b w:val="0"/>
+          <w:i w:val="0"/>
+          <w:color w:val="334155"/>
+          <w:sz w:val="19"/>
+        </w:rPr>
+        <w:t>Managed and enforced AWS Service Control Policies (SCP) across multi-account organization for governance and security.</w:t>
       </w:r>
     </w:p>
     <w:p>
       <w:pPr>
         <w:pStyle w:val="ListBullet"/>
-        <w:spacing w:after="20" w:before="0"/>
+        <w:spacing w:before="20" w:after="20"/>
         <w:ind w:left="227"/>
       </w:pPr>
       <w:r>
         <w:rPr>
+          <w:rFonts w:ascii="Segoe UI" w:hAnsi="Segoe UI"/>
           <w:b w:val="0"/>
           <w:i w:val="0"/>
+          <w:color w:val="334155"/>
           <w:sz w:val="19"/>
         </w:rPr>
-        <w:t>Worked closely with Security team to harden infrastructure, implement IAM best practices, and ensure compliance across environments.</w:t>
+      </w:r>
+      <w:r>
+        <w:rPr>
+          <w:rFonts w:ascii="Segoe UI" w:hAnsi="Segoe UI"/>
+          <w:b w:val="0"/>
+          <w:i w:val="0"/>
+          <w:color w:val="334155"/>
+          <w:sz w:val="19"/>
+        </w:rPr>
+        <w:t>Worked closely with Security team to harden infrastructure, implement IAM best practices, and ensure compliance.</w:t>
       </w:r>
     </w:p>
     <w:p>
       <w:pPr>
         <w:pStyle w:val="ListBullet"/>
-        <w:spacing w:after="20" w:before="0"/>
+        <w:spacing w:before="20" w:after="20"/>
         <w:ind w:left="227"/>
       </w:pPr>
       <w:r>
         <w:rPr>
+          <w:rFonts w:ascii="Segoe UI" w:hAnsi="Segoe UI"/>
           <w:b w:val="0"/>
           <w:i w:val="0"/>
+          <w:color w:val="334155"/>
           <w:sz w:val="19"/>
         </w:rPr>
-        <w:t>Built reusable Terraform/Terragrunt modules and CI/CD pipelines across Jenkins, GitHub Actions, GitLab CI, Bitbucket, and Azure DevOps.</w:t>
+      </w:r>
+      <w:r>
+        <w:rPr>
+          <w:rFonts w:ascii="Segoe UI" w:hAnsi="Segoe UI"/>
+          <w:b w:val="0"/>
+          <w:i w:val="0"/>
+          <w:color w:val="334155"/>
+          <w:sz w:val="19"/>
+        </w:rPr>
+        <w:t>Built reusable Terraform/Terragrunt modules and CI/CD pipelines across Jenkins, GitHub Actions, GitLab CI, Bitbucket, Azure DevOps.</w:t>
       </w:r>
     </w:p>
     <w:p>
       <w:pPr>
         <w:pStyle w:val="ListBullet"/>
-        <w:spacing w:after="20" w:before="0"/>
+        <w:spacing w:before="20" w:after="20"/>
         <w:ind w:left="227"/>
       </w:pPr>
       <w:r>
         <w:rPr>
+          <w:rFonts w:ascii="Segoe UI" w:hAnsi="Segoe UI"/>
           <w:b w:val="0"/>
           <w:i w:val="0"/>
+          <w:color w:val="334155"/>
           <w:sz w:val="19"/>
         </w:rPr>
-        <w:t>Managed Kubernetes clusters (EKS/GKE) with ArgoCD GitOps and Helm, achieving zero-downtime rolling releases.</w:t>
+      </w:r>
+      <w:r>
+        <w:rPr>
+          <w:rFonts w:ascii="Segoe UI" w:hAnsi="Segoe UI"/>
+          <w:b w:val="0"/>
+          <w:i w:val="0"/>
+          <w:color w:val="334155"/>
+          <w:sz w:val="19"/>
+        </w:rPr>
+        <w:t>Managed Kubernetes (EKS/GKE) clusters with ArgoCD GitOps and Helm for zero-downtime deployments.</w:t>
       </w:r>
     </w:p>
     <w:p>
       <w:pPr>
-        <w:spacing w:before="160" w:after="40"/>
+        <w:spacing w:before="200" w:after="60"/>
         <w:pBdr>
-          <w:bottom w:val="single" w:sz="6" w:space="1" w:color="4F46E5"/>
+          <w:bottom w:val="single" w:sz="6" w:space="4" w:color="818CF8"/>
         </w:pBdr>
       </w:pPr>
       <w:r>
         <w:rPr>
+          <w:rFonts w:ascii="Segoe UI" w:hAnsi="Segoe UI"/>
           <w:b/>
           <w:i w:val="0"/>
-          <w:color w:val="4F46E5"/>
+          <w:color w:val="818CF8"/>
           <w:sz w:val="20"/>
         </w:rPr>
         <w:t>PROJECTS</w:t>
@@ -587,36 +714,39 @@
     </w:p>
     <w:p>
       <w:pPr>
-        <w:spacing w:after="0" w:before="80"/>
+        <w:spacing w:before="100" w:after="20"/>
       </w:pPr>
       <w:r>
         <w:rPr>
+          <w:rFonts w:ascii="Segoe UI" w:hAnsi="Segoe UI"/>
           <w:b/>
           <w:i w:val="0"/>
           <w:color w:val="0F172A"/>
-          <w:sz w:val="21"/>
+          <w:sz w:val="20"/>
         </w:rPr>
         <w:t>Fivory — Habit &amp; Productivity App</w:t>
       </w:r>
       <w:r>
         <w:rPr>
+          <w:rFonts w:ascii="Segoe UI" w:hAnsi="Segoe UI"/>
           <w:b w:val="0"/>
           <w:i w:val="0"/>
-          <w:color w:val="4F46E5"/>
+          <w:color w:val="818CF8"/>
           <w:sz w:val="17"/>
         </w:rPr>
-        <w:t xml:space="preserve">  fivory.net · App Store · Google Play</w:t>
+        <w:t xml:space="preserve">  fivory.net</w:t>
       </w:r>
     </w:p>
     <w:p>
       <w:pPr>
-        <w:spacing w:after="20"/>
+        <w:spacing w:before="0" w:after="40"/>
       </w:pPr>
       <w:r>
         <w:rPr>
+          <w:rFonts w:ascii="Segoe UI" w:hAnsi="Segoe UI"/>
           <w:b w:val="0"/>
           <w:i/>
-          <w:color w:val="4F46E5"/>
+          <w:color w:val="818CF8"/>
           <w:sz w:val="17"/>
         </w:rPr>
         <w:t>Flutter · AWS Lambda · API Gateway · DynamoDB · Cognito · S3 · CloudFront · iOS · Android</w:t>
@@ -624,50 +754,54 @@
     </w:p>
     <w:p>
       <w:pPr>
-        <w:spacing w:after="40"/>
+        <w:spacing w:before="0" w:after="60"/>
       </w:pPr>
       <w:r>
         <w:rPr>
+          <w:rFonts w:ascii="Segoe UI" w:hAnsi="Segoe UI"/>
           <w:b w:val="0"/>
           <w:i w:val="0"/>
           <w:color w:val="334155"/>
           <w:sz w:val="19"/>
         </w:rPr>
-        <w:t>Habit and productivity tracker with 500+ active users on iOS and Android. Architected and deployed a fully serverless, secure AWS backend with IAM least-privilege access — built and shipped end-to-end as a solo founder.</w:t>
+        <w:t>Habit and productivity tracker with 500+ active users on iOS and Android. Serverless AWS backend — built and shipped as a solo founder.</w:t>
       </w:r>
     </w:p>
     <w:p>
       <w:pPr>
-        <w:spacing w:after="0" w:before="80"/>
+        <w:spacing w:before="100" w:after="20"/>
       </w:pPr>
       <w:r>
         <w:rPr>
+          <w:rFonts w:ascii="Segoe UI" w:hAnsi="Segoe UI"/>
           <w:b/>
           <w:i w:val="0"/>
           <w:color w:val="0F172A"/>
-          <w:sz w:val="21"/>
+          <w:sz w:val="20"/>
         </w:rPr>
         <w:t>Obsid Workout — Push-up Training App</w:t>
       </w:r>
       <w:r>
         <w:rPr>
+          <w:rFonts w:ascii="Segoe UI" w:hAnsi="Segoe UI"/>
           <w:b w:val="0"/>
           <w:i w:val="0"/>
-          <w:color w:val="4F46E5"/>
+          <w:color w:val="818CF8"/>
           <w:sz w:val="17"/>
         </w:rPr>
-        <w:t xml:space="preserve">  obsid.click · App Store · Google Play</w:t>
+        <w:t xml:space="preserve">  obsid.click</w:t>
       </w:r>
     </w:p>
     <w:p>
       <w:pPr>
-        <w:spacing w:after="20"/>
+        <w:spacing w:before="0" w:after="40"/>
       </w:pPr>
       <w:r>
         <w:rPr>
+          <w:rFonts w:ascii="Segoe UI" w:hAnsi="Segoe UI"/>
           <w:b w:val="0"/>
           <w:i/>
-          <w:color w:val="4F46E5"/>
+          <w:color w:val="818CF8"/>
           <w:sz w:val="17"/>
         </w:rPr>
         <w:t>Flutter · AWS Lambda · API Gateway · DynamoDB · Cognito · S3 · CloudFront · iOS · Android</w:t>
@@ -675,36 +809,39 @@
     </w:p>
     <w:p>
       <w:pPr>
-        <w:spacing w:after="40"/>
+        <w:spacing w:before="0" w:after="60"/>
       </w:pPr>
       <w:r>
         <w:rPr>
+          <w:rFonts w:ascii="Segoe UI" w:hAnsi="Segoe UI"/>
           <w:b w:val="0"/>
           <w:i w:val="0"/>
           <w:color w:val="334155"/>
           <w:sz w:val="19"/>
         </w:rPr>
-        <w:t>Push-up training app with custom workout plans, streak tracking, and body progress on iOS and Android. Secure serverless AWS backend with global CDN delivery via CloudFront — fully built and deployed solo.</w:t>
+        <w:t>Push-up training app with custom plans, streak tracking and body progress. Secure serverless AWS backend with global CDN — built solo.</w:t>
       </w:r>
     </w:p>
     <w:p>
       <w:pPr>
-        <w:spacing w:after="0" w:before="80"/>
+        <w:spacing w:before="100" w:after="20"/>
       </w:pPr>
       <w:r>
         <w:rPr>
+          <w:rFonts w:ascii="Segoe UI" w:hAnsi="Segoe UI"/>
           <w:b/>
           <w:i w:val="0"/>
           <w:color w:val="0F172A"/>
-          <w:sz w:val="21"/>
+          <w:sz w:val="20"/>
         </w:rPr>
         <w:t>FlaskPipeline</w:t>
       </w:r>
       <w:r>
         <w:rPr>
+          <w:rFonts w:ascii="Segoe UI" w:hAnsi="Segoe UI"/>
           <w:b w:val="0"/>
           <w:i w:val="0"/>
-          <w:color w:val="4F46E5"/>
+          <w:color w:val="818CF8"/>
           <w:sz w:val="17"/>
         </w:rPr>
         <w:t xml:space="preserve">  github.com/MatveyGuralskiy</w:t>
@@ -712,13 +849,14 @@
     </w:p>
     <w:p>
       <w:pPr>
-        <w:spacing w:after="20"/>
+        <w:spacing w:before="0" w:after="40"/>
       </w:pPr>
       <w:r>
         <w:rPr>
+          <w:rFonts w:ascii="Segoe UI" w:hAnsi="Segoe UI"/>
           <w:b w:val="0"/>
           <w:i/>
-          <w:color w:val="4F46E5"/>
+          <w:color w:val="818CF8"/>
           <w:sz w:val="17"/>
         </w:rPr>
         <w:t>AWS EKS · Jenkins · GitHub Actions · ArgoCD · Ansible · Terraform · Grafana · Prometheus</w:t>
@@ -726,81 +864,98 @@
     </w:p>
     <w:p>
       <w:pPr>
-        <w:spacing w:after="40"/>
+        <w:spacing w:before="0" w:after="60"/>
       </w:pPr>
       <w:r>
         <w:rPr>
+          <w:rFonts w:ascii="Segoe UI" w:hAnsi="Segoe UI"/>
           <w:b w:val="0"/>
           <w:i w:val="0"/>
           <w:color w:val="334155"/>
           <w:sz w:val="19"/>
         </w:rPr>
-        <w:t>Production-grade GitOps pipeline for a Flask app — CI with Jenkins, CD via GitHub Actions, GitOps with ArgoCD, IaC with Terraform, full observability stack.</w:t>
+        <w:t>Production-grade GitOps pipeline — CI with Jenkins, CD with GitHub Actions, GitOps with ArgoCD, IaC with Terraform, full observability.</w:t>
       </w:r>
     </w:p>
     <w:p>
       <w:pPr>
-        <w:spacing w:after="0" w:before="80"/>
+        <w:spacing w:before="200" w:after="60"/>
+        <w:pBdr>
+          <w:bottom w:val="single" w:sz="6" w:space="4" w:color="818CF8"/>
+        </w:pBdr>
       </w:pPr>
       <w:r>
         <w:rPr>
+          <w:rFonts w:ascii="Segoe UI" w:hAnsi="Segoe UI"/>
           <w:b/>
           <w:i w:val="0"/>
-          <w:color w:val="0F172A"/>
-          <w:sz w:val="21"/>
+          <w:color w:val="818CF8"/>
+          <w:sz w:val="20"/>
         </w:rPr>
-        <w:t>DribbleData</w:t>
-      </w:r>
-      <w:r>
-        <w:rPr>
-          <w:b w:val="0"/>
-          <w:i w:val="0"/>
-          <w:color w:val="4F46E5"/>
-          <w:sz w:val="17"/>
-        </w:rPr>
-        <w:t xml:space="preserve">  github.com/MatveyGuralskiy</w:t>
+        <w:t>EDUCATION</w:t>
       </w:r>
     </w:p>
     <w:p>
       <w:pPr>
-        <w:spacing w:after="20"/>
+        <w:spacing w:before="80" w:after="20"/>
       </w:pPr>
       <w:r>
         <w:rPr>
-          <w:b w:val="0"/>
-          <w:i/>
-          <w:color w:val="4F46E5"/>
-          <w:sz w:val="17"/>
-        </w:rPr>
-        <w:t>AWS EKS · Helm · Terraform · GitHub Actions · Fluent Bit · CloudFront · NoSQL</w:t>
-      </w:r>
-    </w:p>
-    <w:p>
-      <w:pPr>
-        <w:spacing w:after="40"/>
-      </w:pPr>
-      <w:r>
-        <w:rPr>
+          <w:rFonts w:ascii="Segoe UI" w:hAnsi="Segoe UI"/>
           <w:b w:val="0"/>
           <w:i w:val="0"/>
           <w:color w:val="334155"/>
           <w:sz w:val="19"/>
         </w:rPr>
-        <w:t>Flask microservices on AWS EKS with CI/CD, Trivy security scans, Fluent Bit logging, NoSQL, backups, and CloudFront CDN.</w:t>
+        <w:t>AWS Cloud Architect &amp; DevOps  ·  Kernelios, Rishon LeZion  ·  Mar 2024 — Aug 2024</w:t>
       </w:r>
     </w:p>
     <w:p>
       <w:pPr>
-        <w:spacing w:before="160" w:after="40"/>
+        <w:spacing w:before="200" w:after="60"/>
         <w:pBdr>
-          <w:bottom w:val="single" w:sz="6" w:space="1" w:color="4F46E5"/>
+          <w:bottom w:val="single" w:sz="6" w:space="4" w:color="818CF8"/>
         </w:pBdr>
       </w:pPr>
       <w:r>
         <w:rPr>
+          <w:rFonts w:ascii="Segoe UI" w:hAnsi="Segoe UI"/>
           <w:b/>
           <w:i w:val="0"/>
-          <w:color w:val="4F46E5"/>
+          <w:color w:val="818CF8"/>
+          <w:sz w:val="20"/>
+        </w:rPr>
+        <w:t>MILITARY SERVICE</w:t>
+      </w:r>
+    </w:p>
+    <w:p>
+      <w:pPr>
+        <w:spacing w:before="80" w:after="20"/>
+      </w:pPr>
+      <w:r>
+        <w:rPr>
+          <w:rFonts w:ascii="Segoe UI" w:hAnsi="Segoe UI"/>
+          <w:b w:val="0"/>
+          <w:i w:val="0"/>
+          <w:color w:val="334155"/>
+          <w:sz w:val="19"/>
+        </w:rPr>
+        <w:t>Border Police (MAGAV)  ·  2020 — 2023  ·  Recognized for excellence by Brigade Commander</w:t>
+      </w:r>
+    </w:p>
+    <w:p>
+      <w:pPr>
+        <w:spacing w:before="200" w:after="60"/>
+        <w:pBdr>
+          <w:bottom w:val="single" w:sz="6" w:space="4" w:color="818CF8"/>
+        </w:pBdr>
+      </w:pPr>
+      <w:r>
+        <w:rPr>
+          <w:rFonts w:ascii="Segoe UI" w:hAnsi="Segoe UI"/>
+          <w:b/>
+          <w:i w:val="0"/>
+          <w:color w:val="818CF8"/>
           <w:sz w:val="20"/>
         </w:rPr>
         <w:t>CERTIFICATIONS</w:t>
@@ -808,275 +963,55 @@
     </w:p>
     <w:p>
       <w:pPr>
-        <w:pStyle w:val="ListBullet"/>
-        <w:spacing w:after="20" w:before="0"/>
-        <w:ind w:left="227"/>
+        <w:spacing w:before="60" w:after="20"/>
       </w:pPr>
       <w:r>
         <w:rPr>
+          <w:rFonts w:ascii="Segoe UI" w:hAnsi="Segoe UI"/>
           <w:b w:val="0"/>
           <w:i w:val="0"/>
-          <w:sz w:val="19"/>
+          <w:color w:val="334155"/>
+          <w:sz w:val="18"/>
         </w:rPr>
-        <w:t>AWS Solutions Architect Professional</w:t>
+        <w:t>AWS Solutions Architect Professional  ·  AWS DevOps Professional  ·  AWS Solutions Architect Associate  ·  AWS Developer Associate  ·  AWS SysOps Administrator Associate  ·  GCP Cloud Architect Professional  ·  GCP Cloud DevOps Professional  ·  HashiCorp Terraform Associate 003  ·  LPI Linux Essentials + LPIC-1</w:t>
       </w:r>
     </w:p>
     <w:p>
       <w:pPr>
-        <w:pStyle w:val="ListBullet"/>
-        <w:spacing w:after="20" w:before="0"/>
-        <w:ind w:left="227"/>
-      </w:pPr>
-      <w:r>
-        <w:rPr>
-          <w:b w:val="0"/>
-          <w:i w:val="0"/>
-          <w:sz w:val="19"/>
-        </w:rPr>
-        <w:t>AWS Certified DevOps Engineer Professional</w:t>
-      </w:r>
-    </w:p>
-    <w:p>
-      <w:pPr>
-        <w:pStyle w:val="ListBullet"/>
-        <w:spacing w:after="20" w:before="0"/>
-        <w:ind w:left="227"/>
-      </w:pPr>
-      <w:r>
-        <w:rPr>
-          <w:b w:val="0"/>
-          <w:i w:val="0"/>
-          <w:sz w:val="19"/>
-        </w:rPr>
-        <w:t>AWS Certified Solutions Architect Associate</w:t>
-      </w:r>
-    </w:p>
-    <w:p>
-      <w:pPr>
-        <w:pStyle w:val="ListBullet"/>
-        <w:spacing w:after="20" w:before="0"/>
-        <w:ind w:left="227"/>
-      </w:pPr>
-      <w:r>
-        <w:rPr>
-          <w:b w:val="0"/>
-          <w:i w:val="0"/>
-          <w:sz w:val="19"/>
-        </w:rPr>
-        <w:t>AWS Certified Developer Associate</w:t>
-      </w:r>
-    </w:p>
-    <w:p>
-      <w:pPr>
-        <w:pStyle w:val="ListBullet"/>
-        <w:spacing w:after="20" w:before="0"/>
-        <w:ind w:left="227"/>
-      </w:pPr>
-      <w:r>
-        <w:rPr>
-          <w:b w:val="0"/>
-          <w:i w:val="0"/>
-          <w:sz w:val="19"/>
-        </w:rPr>
-        <w:t>AWS Certified SysOps Administrator Associate</w:t>
-      </w:r>
-    </w:p>
-    <w:p>
-      <w:pPr>
-        <w:pStyle w:val="ListBullet"/>
-        <w:spacing w:after="20" w:before="0"/>
-        <w:ind w:left="227"/>
-      </w:pPr>
-      <w:r>
-        <w:rPr>
-          <w:b w:val="0"/>
-          <w:i w:val="0"/>
-          <w:sz w:val="19"/>
-        </w:rPr>
-        <w:t>Google Cloud Professional Cloud Architect</w:t>
-      </w:r>
-    </w:p>
-    <w:p>
-      <w:pPr>
-        <w:pStyle w:val="ListBullet"/>
-        <w:spacing w:after="20" w:before="0"/>
-        <w:ind w:left="227"/>
-      </w:pPr>
-      <w:r>
-        <w:rPr>
-          <w:b w:val="0"/>
-          <w:i w:val="0"/>
-          <w:sz w:val="19"/>
-        </w:rPr>
-        <w:t>Google Cloud Professional DevOps Engineer</w:t>
-      </w:r>
-    </w:p>
-    <w:p>
-      <w:pPr>
-        <w:pStyle w:val="ListBullet"/>
-        <w:spacing w:after="20" w:before="0"/>
-        <w:ind w:left="227"/>
-      </w:pPr>
-      <w:r>
-        <w:rPr>
-          <w:b w:val="0"/>
-          <w:i w:val="0"/>
-          <w:sz w:val="19"/>
-        </w:rPr>
-        <w:t>HashiCorp Certified: Terraform Associate 003</w:t>
-      </w:r>
-    </w:p>
-    <w:p>
-      <w:pPr>
-        <w:pStyle w:val="ListBullet"/>
-        <w:spacing w:after="20" w:before="0"/>
-        <w:ind w:left="227"/>
-      </w:pPr>
-      <w:r>
-        <w:rPr>
-          <w:b w:val="0"/>
-          <w:i w:val="0"/>
-          <w:sz w:val="19"/>
-        </w:rPr>
-        <w:t>LPI Linux Essentials  ·  LPIC-1 Linux Administrator</w:t>
-      </w:r>
-    </w:p>
-    <w:p>
-      <w:pPr>
-        <w:spacing w:before="160" w:after="40"/>
+        <w:spacing w:before="200" w:after="60"/>
         <w:pBdr>
-          <w:bottom w:val="single" w:sz="6" w:space="1" w:color="4F46E5"/>
+          <w:bottom w:val="single" w:sz="6" w:space="4" w:color="818CF8"/>
         </w:pBdr>
       </w:pPr>
       <w:r>
         <w:rPr>
+          <w:rFonts w:ascii="Segoe UI" w:hAnsi="Segoe UI"/>
           <w:b/>
           <w:i w:val="0"/>
-          <w:color w:val="4F46E5"/>
-          <w:sz w:val="20"/>
-        </w:rPr>
-        <w:t>EDUCATION</w:t>
-      </w:r>
-    </w:p>
-    <w:p>
-      <w:pPr>
-        <w:spacing w:after="20"/>
-      </w:pPr>
-      <w:r>
-        <w:rPr>
-          <w:b/>
-          <w:i w:val="0"/>
-          <w:color w:val="0F172A"/>
-          <w:sz w:val="21"/>
-        </w:rPr>
-        <w:t>AWS Cloud Architect &amp; DevOps</w:t>
-      </w:r>
-      <w:r>
-        <w:rPr>
-          <w:b w:val="0"/>
-          <w:i w:val="0"/>
-          <w:color w:val="64748B"/>
-          <w:sz w:val="18"/>
-        </w:rPr>
-        <w:t xml:space="preserve">  ·  Mar 2024 — Aug 2024</w:t>
-      </w:r>
-    </w:p>
-    <w:p>
-      <w:pPr>
-        <w:spacing w:after="40"/>
-      </w:pPr>
-      <w:r>
-        <w:rPr>
-          <w:b w:val="0"/>
-          <w:i w:val="0"/>
-          <w:color w:val="4F46E5"/>
-          <w:sz w:val="19"/>
-        </w:rPr>
-        <w:t>Kernelios · Rishon LeZion, Israel</w:t>
-      </w:r>
-    </w:p>
-    <w:p>
-      <w:pPr>
-        <w:spacing w:before="160" w:after="40"/>
-        <w:pBdr>
-          <w:bottom w:val="single" w:sz="6" w:space="1" w:color="4F46E5"/>
-        </w:pBdr>
-      </w:pPr>
-      <w:r>
-        <w:rPr>
-          <w:b/>
-          <w:i w:val="0"/>
-          <w:color w:val="4F46E5"/>
-          <w:sz w:val="20"/>
-        </w:rPr>
-        <w:t>MILITARY SERVICE</w:t>
-      </w:r>
-    </w:p>
-    <w:p>
-      <w:pPr>
-        <w:spacing w:after="20"/>
-      </w:pPr>
-      <w:r>
-        <w:rPr>
-          <w:b/>
-          <w:i w:val="0"/>
-          <w:color w:val="0F172A"/>
-          <w:sz w:val="21"/>
-        </w:rPr>
-        <w:t>Border Police (MAGAV)</w:t>
-      </w:r>
-      <w:r>
-        <w:rPr>
-          <w:b w:val="0"/>
-          <w:i w:val="0"/>
-          <w:color w:val="64748B"/>
-          <w:sz w:val="18"/>
-        </w:rPr>
-        <w:t xml:space="preserve">  ·  2020 — 2023</w:t>
-      </w:r>
-    </w:p>
-    <w:p>
-      <w:r>
-        <w:rPr>
-          <w:b w:val="0"/>
-          <w:i w:val="0"/>
-          <w:color w:val="4F46E5"/>
-          <w:sz w:val="19"/>
-        </w:rPr>
-        <w:t>Recognized for excellence by Brigade Commander</w:t>
-      </w:r>
-    </w:p>
-    <w:p>
-      <w:pPr>
-        <w:spacing w:before="160" w:after="40"/>
-        <w:pBdr>
-          <w:bottom w:val="single" w:sz="6" w:space="1" w:color="4F46E5"/>
-        </w:pBdr>
-      </w:pPr>
-      <w:r>
-        <w:rPr>
-          <w:b/>
-          <w:i w:val="0"/>
-          <w:color w:val="4F46E5"/>
+          <w:color w:val="818CF8"/>
           <w:sz w:val="20"/>
         </w:rPr>
         <w:t>LANGUAGES</w:t>
       </w:r>
     </w:p>
     <w:p>
+      <w:pPr>
+        <w:spacing w:before="60" w:after="20"/>
+      </w:pPr>
       <w:r>
         <w:rPr>
+          <w:rFonts w:ascii="Segoe UI" w:hAnsi="Segoe UI"/>
           <w:b w:val="0"/>
           <w:i w:val="0"/>
           <w:color w:val="334155"/>
           <w:sz w:val="19"/>
         </w:rPr>
-        <w:t>English: Proficient  ·  Hebrew: Near-Native  ·  Russian: Native</w:t>
+        <w:t>English: Proficient  ·  Hebrew: Native-level  ·  Russian: Native</w:t>
       </w:r>
     </w:p>
     <w:sectPr>
       <w:pgSz w:w="12240" w:h="15840"/>
-      <w:pgMar w:top="680" w:right="850" w:bottom="680" w:left="850" w:header="720" w:footer="720" w:gutter="0"/>
+      <w:pgMar w:top="850" w:right="1020" w:bottom="850" w:left="1020" w:header="720" w:footer="720" w:gutter="0"/>
       <w:cols w:space="720"/>
       <w:docGrid w:linePitch="360"/>
     </w:sectPr>
@@ -1447,10 +1382,6 @@
     <w:name w:val="Normal"/>
     <w:qFormat/>
     <w:rsid w:val="00FC693F"/>
-    <w:rPr>
-      <w:rFonts w:ascii="Calibri" w:hAnsi="Calibri"/>
-      <w:sz w:val="20"/>
-    </w:rPr>
   </w:style>
   <w:style w:type="paragraph" w:styleId="Header">
     <w:name w:val="header"/>

</xml_diff>

<commit_message>
Rewrite resume (EN + HE): SRE/B2C positioning, XYZ bullets, ATS single-column layout
- Reframe summary and experience around high-availability, low-latency,
  high-traffic B2C and reliability (SLA/on-call) to match SRE roles
- Google XYZ-style accomplishment bullets; lead with product/consumer work
- New one-page single-column ATS-friendly PDF/DOCX + previews for both languages
- Update resume page hero summary and career timeline wording
</commit_message>
<xml_diff>
--- a/PDF/resume-eng.docx
+++ b/PDF/resume-eng.docx
@@ -3,1015 +3,1097 @@
 <w:document xmlns:wpc="http://schemas.microsoft.com/office/word/2010/wordprocessingCanvas" xmlns:mo="http://schemas.microsoft.com/office/mac/office/2008/main" xmlns:mc="http://schemas.openxmlformats.org/markup-compatibility/2006" xmlns:mv="urn:schemas-microsoft-com:mac:vml" xmlns:o="urn:schemas-microsoft-com:office:office" xmlns:r="http://schemas.openxmlformats.org/officeDocument/2006/relationships" xmlns:m="http://schemas.openxmlformats.org/officeDocument/2006/math" xmlns:v="urn:schemas-microsoft-com:vml" xmlns:wp14="http://schemas.microsoft.com/office/word/2010/wordprocessingDrawing" xmlns:wp="http://schemas.openxmlformats.org/drawingml/2006/wordprocessingDrawing" xmlns:w10="urn:schemas-microsoft-com:office:word" xmlns:w="http://schemas.openxmlformats.org/wordprocessingml/2006/main" xmlns:w14="http://schemas.microsoft.com/office/word/2010/wordml" xmlns:wpg="http://schemas.microsoft.com/office/word/2010/wordprocessingGroup" xmlns:wpi="http://schemas.microsoft.com/office/word/2010/wordprocessingInk" xmlns:wne="http://schemas.microsoft.com/office/word/2006/wordml" xmlns:wps="http://schemas.microsoft.com/office/word/2010/wordprocessingShape" mc:Ignorable="w14 wp14">
   <w:body>
     <w:p>
-      <w:pPr>
-        <w:spacing w:before="0" w:after="40"/>
-      </w:pPr>
       <w:r>
         <w:rPr>
-          <w:rFonts w:ascii="Segoe UI" w:hAnsi="Segoe UI"/>
           <w:b/>
           <w:i w:val="0"/>
-          <w:color w:val="0F172A"/>
-          <w:sz w:val="44"/>
+          <w:sz w:val="48"/>
         </w:rPr>
         <w:t>Matvey Guralskiy</w:t>
       </w:r>
     </w:p>
     <w:p>
       <w:pPr>
-        <w:spacing w:before="0" w:after="120"/>
+        <w:spacing w:after="40"/>
       </w:pPr>
       <w:r>
         <w:rPr>
-          <w:rFonts w:ascii="Segoe UI" w:hAnsi="Segoe UI"/>
-          <w:b w:val="0"/>
+          <w:b/>
           <w:i w:val="0"/>
-          <w:color w:val="64748B"/>
-          <w:sz w:val="18"/>
+          <w:color w:val="4F46E5"/>
+          <w:sz w:val="24"/>
         </w:rPr>
-        <w:t>DevOps Engineer  ·  054-5433696  ·  mathewguralskiy@gmail.com  ·  matveyguralskiy.com  ·  github.com/MatveyGuralskiy  ·  Israel</w:t>
+        <w:t>DevOps / SRE Engineer — High-Scale B2C Cloud</w:t>
       </w:r>
     </w:p>
     <w:p>
       <w:pPr>
-        <w:spacing w:before="200" w:after="60"/>
         <w:pBdr>
-          <w:bottom w:val="single" w:sz="6" w:space="4" w:color="818CF8"/>
+          <w:bottom w:val="single" w:sz="6" w:space="2" w:color="4f46e5"/>
+        </w:pBdr>
+        <w:spacing w:after="40"/>
+      </w:pPr>
+      <w:r>
+        <w:rPr>
+          <w:b w:val="0"/>
+          <w:i w:val="0"/>
+          <w:color w:val="5B6472"/>
+          <w:sz w:val="18"/>
+        </w:rPr>
+        <w:t>Israel  •  054-5433696  •  mathewguralskiy@gmail.com  •  matveyguralskiy.com  •  github.com/MatveyGuralskiy</w:t>
+      </w:r>
+    </w:p>
+    <w:p>
+      <w:pPr>
+        <w:spacing w:before="140" w:after="60"/>
+        <w:pBdr>
+          <w:bottom w:val="single" w:sz="6" w:space="2" w:color="4f46e5"/>
         </w:pBdr>
       </w:pPr>
       <w:r>
         <w:rPr>
-          <w:rFonts w:ascii="Segoe UI" w:hAnsi="Segoe UI"/>
           <w:b/>
           <w:i w:val="0"/>
-          <w:color w:val="818CF8"/>
-          <w:sz w:val="20"/>
+          <w:color w:val="4F46E5"/>
+          <w:sz w:val="21"/>
+        </w:rPr>
+        <w:t>SUMMARY</w:t>
+      </w:r>
+    </w:p>
+    <w:p>
+      <w:r>
+        <w:rPr>
+          <w:b w:val="0"/>
+          <w:i w:val="0"/>
+          <w:sz w:val="19"/>
+        </w:rPr>
+        <w:t xml:space="preserve">DevOps &amp; SRE engineer with 2+ years building </w:t>
+      </w:r>
+      <w:r>
+        <w:rPr>
+          <w:b/>
+          <w:i w:val="0"/>
+          <w:sz w:val="19"/>
+        </w:rPr>
+        <w:t>highly-available, low-latency</w:t>
+      </w:r>
+      <w:r>
+        <w:rPr>
+          <w:b w:val="0"/>
+          <w:i w:val="0"/>
+          <w:sz w:val="19"/>
+        </w:rPr>
+        <w:t xml:space="preserve"> infrastructure for </w:t>
+      </w:r>
+      <w:r>
+        <w:rPr>
+          <w:b/>
+          <w:i w:val="0"/>
+          <w:sz w:val="19"/>
+        </w:rPr>
+        <w:t>high-traffic</w:t>
+      </w:r>
+      <w:r>
+        <w:rPr>
+          <w:b w:val="0"/>
+          <w:i w:val="0"/>
+          <w:sz w:val="19"/>
+        </w:rPr>
+        <w:t xml:space="preserve"> platforms on AWS and GCP. Ships production </w:t>
+      </w:r>
+      <w:r>
+        <w:rPr>
+          <w:b/>
+          <w:i w:val="0"/>
+          <w:sz w:val="19"/>
+        </w:rPr>
+        <w:t>B2C products</w:t>
+      </w:r>
+      <w:r>
+        <w:rPr>
+          <w:b w:val="0"/>
+          <w:i w:val="0"/>
+          <w:sz w:val="19"/>
+        </w:rPr>
+        <w:t xml:space="preserve"> end-to-end — from serverless app backends with live App Store users to Moovit-scale public-transit web apps. Deep in </w:t>
+      </w:r>
+      <w:r>
+        <w:rPr>
+          <w:b/>
+          <w:i w:val="0"/>
+          <w:sz w:val="19"/>
+        </w:rPr>
+        <w:t>Kubernetes</w:t>
+      </w:r>
+      <w:r>
+        <w:rPr>
+          <w:b w:val="0"/>
+          <w:i w:val="0"/>
+          <w:sz w:val="19"/>
+        </w:rPr>
+        <w:t xml:space="preserve">, full-cycle </w:t>
+      </w:r>
+      <w:r>
+        <w:rPr>
+          <w:b/>
+          <w:i w:val="0"/>
+          <w:sz w:val="19"/>
+        </w:rPr>
+        <w:t>CI/CD</w:t>
+      </w:r>
+      <w:r>
+        <w:rPr>
+          <w:b w:val="0"/>
+          <w:i w:val="0"/>
+          <w:sz w:val="19"/>
+        </w:rPr>
+        <w:t xml:space="preserve">, GitOps and IaC, with hands-on reliability engineering (monitoring, SLA, on-call). </w:t>
+      </w:r>
+      <w:r>
+        <w:rPr>
+          <w:b/>
+          <w:i w:val="0"/>
+          <w:sz w:val="19"/>
+        </w:rPr>
+        <w:t>10 cloud certifications</w:t>
+      </w:r>
+      <w:r>
+        <w:rPr>
+          <w:b w:val="0"/>
+          <w:i w:val="0"/>
+          <w:sz w:val="19"/>
+        </w:rPr>
+        <w:t>, including AWS and GCP Professional.</w:t>
+      </w:r>
+    </w:p>
+    <w:p>
+      <w:pPr>
+        <w:spacing w:before="140" w:after="60"/>
+        <w:pBdr>
+          <w:bottom w:val="single" w:sz="6" w:space="2" w:color="4f46e5"/>
+        </w:pBdr>
+      </w:pPr>
+      <w:r>
+        <w:rPr>
+          <w:b/>
+          <w:i w:val="0"/>
+          <w:color w:val="4F46E5"/>
+          <w:sz w:val="21"/>
         </w:rPr>
         <w:t>SKILLS</w:t>
       </w:r>
     </w:p>
     <w:p>
       <w:pPr>
-        <w:spacing w:before="40" w:after="20"/>
+        <w:spacing w:after="20"/>
       </w:pPr>
       <w:r>
         <w:rPr>
-          <w:rFonts w:ascii="Segoe UI" w:hAnsi="Segoe UI"/>
           <w:b/>
           <w:i w:val="0"/>
-          <w:color w:val="64748B"/>
-          <w:sz w:val="18"/>
+          <w:color w:val="4F46E5"/>
+          <w:sz w:val="19"/>
         </w:rPr>
-        <w:t xml:space="preserve">Cloud: </w:t>
+        <w:t xml:space="preserve">Core:  </w:t>
       </w:r>
       <w:r>
         <w:rPr>
-          <w:rFonts w:ascii="Segoe UI" w:hAnsi="Segoe UI"/>
           <w:b w:val="0"/>
           <w:i w:val="0"/>
-          <w:color w:val="C7D2FE"/>
-          <w:sz w:val="18"/>
+          <w:sz w:val="19"/>
+        </w:rPr>
+        <w:t>AWS · Kubernetes (EKS) · Linux · CI/CD · Terraform · Python / Bash</w:t>
+      </w:r>
+    </w:p>
+    <w:p>
+      <w:pPr>
+        <w:spacing w:after="20"/>
+      </w:pPr>
+      <w:r>
+        <w:rPr>
+          <w:b/>
+          <w:i w:val="0"/>
+          <w:color w:val="4F46E5"/>
+          <w:sz w:val="19"/>
+        </w:rPr>
+        <w:t xml:space="preserve">Reliability:  </w:t>
+      </w:r>
+      <w:r>
+        <w:rPr>
+          <w:b w:val="0"/>
+          <w:i w:val="0"/>
+          <w:sz w:val="19"/>
+        </w:rPr>
+        <w:t>Prometheus · Grafana · Fluentd · SLA / SLO · On-call · Autoscaling</w:t>
+      </w:r>
+    </w:p>
+    <w:p>
+      <w:pPr>
+        <w:spacing w:after="20"/>
+      </w:pPr>
+      <w:r>
+        <w:rPr>
+          <w:b/>
+          <w:i w:val="0"/>
+          <w:color w:val="12151C"/>
+          <w:sz w:val="19"/>
+        </w:rPr>
+        <w:t xml:space="preserve">Cloud:  </w:t>
+      </w:r>
+      <w:r>
+        <w:rPr>
+          <w:b w:val="0"/>
+          <w:i w:val="0"/>
+          <w:sz w:val="19"/>
         </w:rPr>
         <w:t>AWS · GCP · Azure</w:t>
       </w:r>
     </w:p>
     <w:p>
       <w:pPr>
-        <w:spacing w:before="40" w:after="20"/>
+        <w:spacing w:after="20"/>
       </w:pPr>
       <w:r>
         <w:rPr>
-          <w:rFonts w:ascii="Segoe UI" w:hAnsi="Segoe UI"/>
           <w:b/>
           <w:i w:val="0"/>
-          <w:color w:val="64748B"/>
-          <w:sz w:val="18"/>
+          <w:color w:val="12151C"/>
+          <w:sz w:val="19"/>
         </w:rPr>
-        <w:t xml:space="preserve">IaC &amp; Config: </w:t>
+        <w:t xml:space="preserve">IaC &amp; Config:  </w:t>
       </w:r>
       <w:r>
         <w:rPr>
-          <w:rFonts w:ascii="Segoe UI" w:hAnsi="Segoe UI"/>
           <w:b w:val="0"/>
           <w:i w:val="0"/>
-          <w:color w:val="C7D2FE"/>
-          <w:sz w:val="18"/>
+          <w:sz w:val="19"/>
         </w:rPr>
         <w:t>Terraform · Terragrunt · Ansible · Helm</w:t>
       </w:r>
     </w:p>
     <w:p>
       <w:pPr>
-        <w:spacing w:before="40" w:after="20"/>
+        <w:spacing w:after="20"/>
       </w:pPr>
       <w:r>
         <w:rPr>
-          <w:rFonts w:ascii="Segoe UI" w:hAnsi="Segoe UI"/>
           <w:b/>
           <w:i w:val="0"/>
-          <w:color w:val="64748B"/>
-          <w:sz w:val="18"/>
+          <w:color w:val="12151C"/>
+          <w:sz w:val="19"/>
         </w:rPr>
-        <w:t xml:space="preserve">Containers: </w:t>
+        <w:t xml:space="preserve">Containers:  </w:t>
       </w:r>
       <w:r>
         <w:rPr>
-          <w:rFonts w:ascii="Segoe UI" w:hAnsi="Segoe UI"/>
           <w:b w:val="0"/>
           <w:i w:val="0"/>
-          <w:color w:val="C7D2FE"/>
-          <w:sz w:val="18"/>
+          <w:sz w:val="19"/>
         </w:rPr>
         <w:t>Kubernetes · Docker · ArgoCD · ECS · ECR · EKS</w:t>
       </w:r>
     </w:p>
     <w:p>
       <w:pPr>
-        <w:spacing w:before="40" w:after="20"/>
+        <w:spacing w:after="20"/>
       </w:pPr>
       <w:r>
         <w:rPr>
-          <w:rFonts w:ascii="Segoe UI" w:hAnsi="Segoe UI"/>
           <w:b/>
           <w:i w:val="0"/>
-          <w:color w:val="64748B"/>
-          <w:sz w:val="18"/>
+          <w:color w:val="12151C"/>
+          <w:sz w:val="19"/>
         </w:rPr>
-        <w:t xml:space="preserve">CI/CD: </w:t>
+        <w:t xml:space="preserve">CI / CD:  </w:t>
       </w:r>
       <w:r>
         <w:rPr>
-          <w:rFonts w:ascii="Segoe UI" w:hAnsi="Segoe UI"/>
           <w:b w:val="0"/>
           <w:i w:val="0"/>
-          <w:color w:val="C7D2FE"/>
-          <w:sz w:val="18"/>
+          <w:sz w:val="19"/>
         </w:rPr>
         <w:t>Jenkins · GitHub Actions · GitLab CI · Bitbucket · Azure DevOps</w:t>
       </w:r>
     </w:p>
     <w:p>
       <w:pPr>
-        <w:spacing w:before="40" w:after="20"/>
+        <w:spacing w:after="20"/>
       </w:pPr>
       <w:r>
         <w:rPr>
-          <w:rFonts w:ascii="Segoe UI" w:hAnsi="Segoe UI"/>
           <w:b/>
           <w:i w:val="0"/>
-          <w:color w:val="64748B"/>
-          <w:sz w:val="18"/>
+          <w:color w:val="12151C"/>
+          <w:sz w:val="19"/>
         </w:rPr>
-        <w:t xml:space="preserve">Observability: </w:t>
+        <w:t xml:space="preserve">Development:  </w:t>
       </w:r>
       <w:r>
         <w:rPr>
-          <w:rFonts w:ascii="Segoe UI" w:hAnsi="Segoe UI"/>
           <w:b w:val="0"/>
           <w:i w:val="0"/>
-          <w:color w:val="C7D2FE"/>
-          <w:sz w:val="18"/>
+          <w:sz w:val="19"/>
         </w:rPr>
-        <w:t>Prometheus · Grafana · Fluentd</w:t>
+        <w:t>Python · Bash · Flask · SQL · Flutter</w:t>
       </w:r>
     </w:p>
     <w:p>
       <w:pPr>
-        <w:spacing w:before="40" w:after="20"/>
+        <w:spacing w:after="20"/>
       </w:pPr>
       <w:r>
         <w:rPr>
-          <w:rFonts w:ascii="Segoe UI" w:hAnsi="Segoe UI"/>
           <w:b/>
           <w:i w:val="0"/>
-          <w:color w:val="64748B"/>
-          <w:sz w:val="18"/>
+          <w:color w:val="12151C"/>
+          <w:sz w:val="19"/>
         </w:rPr>
-        <w:t xml:space="preserve">Platform Automation: </w:t>
+        <w:t xml:space="preserve">AI &amp; Automation:  </w:t>
       </w:r>
       <w:r>
         <w:rPr>
-          <w:rFonts w:ascii="Segoe UI" w:hAnsi="Segoe UI"/>
           <w:b w:val="0"/>
           <w:i w:val="0"/>
-          <w:color w:val="C7D2FE"/>
-          <w:sz w:val="18"/>
+          <w:sz w:val="19"/>
         </w:rPr>
-        <w:t>Torque (Quali)</w:t>
+        <w:t>Claude Code · Cursor · AWS Bedrock · Gemini</w:t>
       </w:r>
     </w:p>
     <w:p>
       <w:pPr>
-        <w:spacing w:before="40" w:after="20"/>
-      </w:pPr>
-      <w:r>
-        <w:rPr>
-          <w:rFonts w:ascii="Segoe UI" w:hAnsi="Segoe UI"/>
-          <w:b/>
-          <w:i w:val="0"/>
-          <w:color w:val="64748B"/>
-          <w:sz w:val="18"/>
-        </w:rPr>
-        <w:t xml:space="preserve">Development: </w:t>
-      </w:r>
-      <w:r>
-        <w:rPr>
-          <w:rFonts w:ascii="Segoe UI" w:hAnsi="Segoe UI"/>
-          <w:b w:val="0"/>
-          <w:i w:val="0"/>
-          <w:color w:val="C7D2FE"/>
-          <w:sz w:val="18"/>
-        </w:rPr>
-        <w:t>Python · Bash · Flutter · Flask · SQL</w:t>
-      </w:r>
-    </w:p>
-    <w:p>
-      <w:pPr>
-        <w:spacing w:before="40" w:after="20"/>
-      </w:pPr>
-      <w:r>
-        <w:rPr>
-          <w:rFonts w:ascii="Segoe UI" w:hAnsi="Segoe UI"/>
-          <w:b/>
-          <w:i w:val="0"/>
-          <w:color w:val="64748B"/>
-          <w:sz w:val="18"/>
-        </w:rPr>
-        <w:t xml:space="preserve">AI &amp; Automation: </w:t>
-      </w:r>
-      <w:r>
-        <w:rPr>
-          <w:rFonts w:ascii="Segoe UI" w:hAnsi="Segoe UI"/>
-          <w:b w:val="0"/>
-          <w:i w:val="0"/>
-          <w:color w:val="C7D2FE"/>
-          <w:sz w:val="18"/>
-        </w:rPr>
-        <w:t>Gemini AI · Claude Code · Cursor AI · AWS Bedrock</w:t>
-      </w:r>
-    </w:p>
-    <w:p>
-      <w:pPr>
-        <w:spacing w:before="200" w:after="60"/>
+        <w:spacing w:before="140" w:after="60"/>
         <w:pBdr>
-          <w:bottom w:val="single" w:sz="6" w:space="4" w:color="818CF8"/>
+          <w:bottom w:val="single" w:sz="6" w:space="2" w:color="4f46e5"/>
         </w:pBdr>
       </w:pPr>
       <w:r>
         <w:rPr>
-          <w:rFonts w:ascii="Segoe UI" w:hAnsi="Segoe UI"/>
           <w:b/>
           <w:i w:val="0"/>
-          <w:color w:val="818CF8"/>
-          <w:sz w:val="20"/>
-        </w:rPr>
-        <w:t>SUMMARY</w:t>
-      </w:r>
-    </w:p>
-    <w:p>
-      <w:pPr>
-        <w:spacing w:before="60" w:after="60"/>
-      </w:pPr>
-      <w:r>
-        <w:rPr>
-          <w:rFonts w:ascii="Segoe UI" w:hAnsi="Segoe UI"/>
-          <w:b w:val="0"/>
-          <w:i w:val="0"/>
-          <w:color w:val="334155"/>
-          <w:sz w:val="19"/>
-        </w:rPr>
-        <w:t>DevOps Engineer specializing in cloud infrastructure on AWS and GCP for enterprise clients. Skilled in full-cycle CI/CD, GitOps, IaC, and AI-driven automation. Holds 10 cloud certifications including AWS and GCP Professional levels.</w:t>
-      </w:r>
-    </w:p>
-    <w:p>
-      <w:pPr>
-        <w:spacing w:before="200" w:after="60"/>
-        <w:pBdr>
-          <w:bottom w:val="single" w:sz="6" w:space="4" w:color="818CF8"/>
-        </w:pBdr>
-      </w:pPr>
-      <w:r>
-        <w:rPr>
-          <w:rFonts w:ascii="Segoe UI" w:hAnsi="Segoe UI"/>
-          <w:b/>
-          <w:i w:val="0"/>
-          <w:color w:val="818CF8"/>
-          <w:sz w:val="20"/>
+          <w:color w:val="4F46E5"/>
+          <w:sz w:val="21"/>
         </w:rPr>
         <w:t>EXPERIENCE</w:t>
       </w:r>
     </w:p>
     <w:p>
       <w:pPr>
-        <w:spacing w:before="120" w:after="20"/>
+        <w:tabs>
+          <w:tab w:pos="10318" w:val="right"/>
+        </w:tabs>
+        <w:spacing w:before="60"/>
       </w:pPr>
       <w:r>
         <w:rPr>
-          <w:rFonts w:ascii="Segoe UI" w:hAnsi="Segoe UI"/>
           <w:b/>
           <w:i w:val="0"/>
-          <w:color w:val="0F172A"/>
           <w:sz w:val="21"/>
         </w:rPr>
         <w:t>DevOps Engineer</w:t>
       </w:r>
       <w:r>
         <w:rPr>
-          <w:rFonts w:ascii="Segoe UI" w:hAnsi="Segoe UI"/>
           <w:b w:val="0"/>
           <w:i w:val="0"/>
-          <w:color w:val="64748B"/>
-          <w:sz w:val="18"/>
+          <w:color w:val="5B6472"/>
+          <w:sz w:val="20"/>
         </w:rPr>
-        <w:t xml:space="preserve">  ·  </w:t>
+        <w:t xml:space="preserve">  ·  Compie Technologies · Ramat Gan, Israel · Hybrid</w:t>
       </w:r>
       <w:r>
         <w:rPr>
-          <w:rFonts w:ascii="Segoe UI" w:hAnsi="Segoe UI"/>
           <w:b w:val="0"/>
           <w:i w:val="0"/>
-          <w:color w:val="64748B"/>
+          <w:color w:val="5B6472"/>
           <w:sz w:val="18"/>
         </w:rPr>
+        <w:tab/>
         <w:t>Sep 2025 — Present</w:t>
       </w:r>
     </w:p>
     <w:p>
       <w:pPr>
-        <w:spacing w:before="0" w:after="40"/>
+        <w:spacing w:after="40"/>
+        <w:ind w:left="227" w:hanging="227"/>
       </w:pPr>
       <w:r>
         <w:rPr>
-          <w:rFonts w:ascii="Segoe UI" w:hAnsi="Segoe UI"/>
           <w:b w:val="0"/>
           <w:i w:val="0"/>
-          <w:color w:val="818CF8"/>
-          <w:sz w:val="18"/>
+          <w:color w:val="4F46E5"/>
+          <w:sz w:val="14"/>
         </w:rPr>
-        <w:t>Compie Technologies · Ramat Gan, Israel · Hybrid</w:t>
+        <w:t xml:space="preserve">▪  </w:t>
+      </w:r>
+      <w:r>
+        <w:rPr>
+          <w:b/>
+          <w:i w:val="0"/>
+        </w:rPr>
+        <w:t>Ministry of Transport / Maslulan</w:t>
+      </w:r>
+      <w:r>
+        <w:rPr>
+          <w:b w:val="0"/>
+          <w:i w:val="0"/>
+        </w:rPr>
+        <w:t xml:space="preserve"> (Moovit-like consumer transit web app) — delivered a highly-available, low-latency platform for a high-traffic public product, by architecting end-to-end AWS infrastructure with centralized logging, a full monitoring &amp; alerting stack (Prometheus / Grafana) and CI/CD pipelines.</w:t>
       </w:r>
     </w:p>
     <w:p>
       <w:pPr>
-        <w:pStyle w:val="ListBullet"/>
-        <w:spacing w:before="20" w:after="20"/>
-        <w:ind w:left="227"/>
+        <w:spacing w:after="40"/>
+        <w:ind w:left="227" w:hanging="227"/>
       </w:pPr>
       <w:r>
         <w:rPr>
-          <w:rFonts w:ascii="Segoe UI" w:hAnsi="Segoe UI"/>
+          <w:b w:val="0"/>
+          <w:i w:val="0"/>
+          <w:color w:val="4F46E5"/>
+          <w:sz w:val="14"/>
+        </w:rPr>
+        <w:t xml:space="preserve">▪  </w:t>
+      </w:r>
+      <w:r>
+        <w:rPr>
           <w:b/>
           <w:i w:val="0"/>
-          <w:color w:val="334155"/>
-          <w:sz w:val="19"/>
         </w:rPr>
         <w:t>Bank Hapoalim</w:t>
       </w:r>
       <w:r>
         <w:rPr>
-          <w:rFonts w:ascii="Segoe UI" w:hAnsi="Segoe UI"/>
           <w:b w:val="0"/>
           <w:i w:val="0"/>
-          <w:color w:val="334155"/>
-          <w:sz w:val="19"/>
         </w:rPr>
-        <w:t xml:space="preserve"> — Platform team: Torque (Quali) automation, GitLab CI pipelines, EKS cluster management and infrastructure automations.</w:t>
+        <w:t xml:space="preserve"> (Platform team) — improved release reliability across production </w:t>
+      </w:r>
+      <w:r>
+        <w:rPr>
+          <w:b/>
+          <w:i w:val="0"/>
+        </w:rPr>
+        <w:t>EKS</w:t>
+      </w:r>
+      <w:r>
+        <w:rPr>
+          <w:b w:val="0"/>
+          <w:i w:val="0"/>
+        </w:rPr>
+        <w:t xml:space="preserve"> clusters by building GitLab CI pipelines and automating environment provisioning with Torque (Quali).</w:t>
       </w:r>
     </w:p>
     <w:p>
       <w:pPr>
-        <w:pStyle w:val="ListBullet"/>
-        <w:spacing w:before="20" w:after="20"/>
-        <w:ind w:left="227"/>
+        <w:spacing w:after="40"/>
+        <w:ind w:left="227" w:hanging="227"/>
       </w:pPr>
       <w:r>
         <w:rPr>
-          <w:rFonts w:ascii="Segoe UI" w:hAnsi="Segoe UI"/>
+          <w:b w:val="0"/>
+          <w:i w:val="0"/>
+          <w:color w:val="4F46E5"/>
+          <w:sz w:val="14"/>
+        </w:rPr>
+        <w:t xml:space="preserve">▪  </w:t>
+      </w:r>
+      <w:r>
+        <w:rPr>
           <w:b/>
           <w:i w:val="0"/>
-          <w:color w:val="334155"/>
-          <w:sz w:val="19"/>
+        </w:rPr>
+        <w:t>Topocad</w:t>
+      </w:r>
+      <w:r>
+        <w:rPr>
+          <w:b w:val="0"/>
+          <w:i w:val="0"/>
+        </w:rPr>
+        <w:t xml:space="preserve"> (GIS SaaS on AWS) — scaled containerized </w:t>
+      </w:r>
+      <w:r>
+        <w:rPr>
+          <w:b/>
+          <w:i w:val="0"/>
+        </w:rPr>
+        <w:t>ECS</w:t>
+      </w:r>
+      <w:r>
+        <w:rPr>
+          <w:b w:val="0"/>
+          <w:i w:val="0"/>
+        </w:rPr>
+        <w:t xml:space="preserve"> microservices by designing autoscaling infrastructure with Terraform and Bitbucket CI/CD.</w:t>
+      </w:r>
+    </w:p>
+    <w:p>
+      <w:pPr>
+        <w:spacing w:after="40"/>
+        <w:ind w:left="227" w:hanging="227"/>
+      </w:pPr>
+      <w:r>
+        <w:rPr>
+          <w:b w:val="0"/>
+          <w:i w:val="0"/>
+          <w:color w:val="4F46E5"/>
+          <w:sz w:val="14"/>
+        </w:rPr>
+        <w:t xml:space="preserve">▪  </w:t>
+      </w:r>
+      <w:r>
+        <w:rPr>
+          <w:b/>
+          <w:i w:val="0"/>
         </w:rPr>
         <w:t>Mapi</w:t>
       </w:r>
       <w:r>
         <w:rPr>
-          <w:rFonts w:ascii="Segoe UI" w:hAnsi="Segoe UI"/>
           <w:b w:val="0"/>
           <w:i w:val="0"/>
-          <w:color w:val="334155"/>
-          <w:sz w:val="19"/>
         </w:rPr>
-        <w:t xml:space="preserve"> — Landing Zone: Central API Gateway, Shared Core Endpoints, Central S3 with STS, multi-account AWS with Terraform.</w:t>
+        <w:t xml:space="preserve"> — enabled secure access at scale by architecting a multi-account Landing Zone with a central API Gateway, shared core endpoints and STS-based cross-account S3.</w:t>
       </w:r>
     </w:p>
     <w:p>
       <w:pPr>
-        <w:pStyle w:val="ListBullet"/>
-        <w:spacing w:before="20" w:after="20"/>
-        <w:ind w:left="227"/>
+        <w:tabs>
+          <w:tab w:pos="10318" w:val="right"/>
+        </w:tabs>
+        <w:spacing w:before="60"/>
       </w:pPr>
       <w:r>
         <w:rPr>
-          <w:rFonts w:ascii="Segoe UI" w:hAnsi="Segoe UI"/>
           <w:b/>
           <w:i w:val="0"/>
-          <w:color w:val="334155"/>
-          <w:sz w:val="19"/>
-        </w:rPr>
-        <w:t>Topocad</w:t>
-      </w:r>
-      <w:r>
-        <w:rPr>
-          <w:rFonts w:ascii="Segoe UI" w:hAnsi="Segoe UI"/>
-          <w:b w:val="0"/>
-          <w:i w:val="0"/>
-          <w:color w:val="334155"/>
-          <w:sz w:val="19"/>
-        </w:rPr>
-        <w:t xml:space="preserve"> — GIS platform on AWS: full infrastructure with Terraform, Bitbucket Pipelines CI/CD, ECS microservices deployment.</w:t>
-      </w:r>
-    </w:p>
-    <w:p>
-      <w:pPr>
-        <w:pStyle w:val="ListBullet"/>
-        <w:spacing w:before="20" w:after="20"/>
-        <w:ind w:left="227"/>
-      </w:pPr>
-      <w:r>
-        <w:rPr>
-          <w:rFonts w:ascii="Segoe UI" w:hAnsi="Segoe UI"/>
-          <w:b/>
-          <w:i w:val="0"/>
-          <w:color w:val="334155"/>
-          <w:sz w:val="19"/>
-        </w:rPr>
-        <w:t>Ministry of Transport</w:t>
-      </w:r>
-      <w:r>
-        <w:rPr>
-          <w:rFonts w:ascii="Segoe UI" w:hAnsi="Segoe UI"/>
-          <w:b w:val="0"/>
-          <w:i w:val="0"/>
-          <w:color w:val="334155"/>
-          <w:sz w:val="19"/>
-        </w:rPr>
-        <w:t xml:space="preserve"> — Maslulan (Moovit-like app): end-to-end infra, centralized logging, monitoring and full CI/CD.</w:t>
-      </w:r>
-    </w:p>
-    <w:p>
-      <w:pPr>
-        <w:pStyle w:val="ListBullet"/>
-        <w:spacing w:before="20" w:after="20"/>
-        <w:ind w:left="227"/>
-      </w:pPr>
-      <w:r>
-        <w:rPr>
-          <w:rFonts w:ascii="Segoe UI" w:hAnsi="Segoe UI"/>
-          <w:b/>
-          <w:i w:val="0"/>
-          <w:color w:val="334155"/>
-          <w:sz w:val="19"/>
-        </w:rPr>
-        <w:t>Ministry of Justice</w:t>
-      </w:r>
-      <w:r>
-        <w:rPr>
-          <w:rFonts w:ascii="Segoe UI" w:hAnsi="Segoe UI"/>
-          <w:b w:val="0"/>
-          <w:i w:val="0"/>
-          <w:color w:val="334155"/>
-          <w:sz w:val="19"/>
-        </w:rPr>
-        <w:t xml:space="preserve"> — Platform automations with Torque (Quali) and Terraform for environment provisioning and governance.</w:t>
-      </w:r>
-    </w:p>
-    <w:p>
-      <w:pPr>
-        <w:pStyle w:val="ListBullet"/>
-        <w:spacing w:before="20" w:after="20"/>
-        <w:ind w:left="227"/>
-      </w:pPr>
-      <w:r>
-        <w:rPr>
-          <w:rFonts w:ascii="Segoe UI" w:hAnsi="Segoe UI"/>
-          <w:b/>
-          <w:i w:val="0"/>
-          <w:color w:val="334155"/>
-          <w:sz w:val="19"/>
-        </w:rPr>
-        <w:t>Israel Aerospace Industries (IAI)</w:t>
-      </w:r>
-      <w:r>
-        <w:rPr>
-          <w:rFonts w:ascii="Segoe UI" w:hAnsi="Segoe UI"/>
-          <w:b w:val="0"/>
-          <w:i w:val="0"/>
-          <w:color w:val="334155"/>
-          <w:sz w:val="19"/>
-        </w:rPr>
-        <w:t xml:space="preserve"> — Lifted the entire main WordPress site from scratch using Terraform and GitHub, including cloud infrastructure, networking, storage, and full deployment.</w:t>
-      </w:r>
-    </w:p>
-    <w:p>
-      <w:pPr>
-        <w:spacing w:before="120" w:after="20"/>
-      </w:pPr>
-      <w:r>
-        <w:rPr>
-          <w:rFonts w:ascii="Segoe UI" w:hAnsi="Segoe UI"/>
-          <w:b/>
-          <w:i w:val="0"/>
-          <w:color w:val="0F172A"/>
           <w:sz w:val="21"/>
         </w:rPr>
         <w:t>DevOps Engineer</w:t>
       </w:r>
       <w:r>
         <w:rPr>
-          <w:rFonts w:ascii="Segoe UI" w:hAnsi="Segoe UI"/>
           <w:b w:val="0"/>
           <w:i w:val="0"/>
-          <w:color w:val="64748B"/>
-          <w:sz w:val="18"/>
+          <w:color w:val="5B6472"/>
+          <w:sz w:val="20"/>
         </w:rPr>
-        <w:t xml:space="preserve">  ·  </w:t>
+        <w:t xml:space="preserve">  ·  Ness Technology · Ra'anana, Israel</w:t>
       </w:r>
       <w:r>
         <w:rPr>
-          <w:rFonts w:ascii="Segoe UI" w:hAnsi="Segoe UI"/>
           <w:b w:val="0"/>
           <w:i w:val="0"/>
-          <w:color w:val="64748B"/>
+          <w:color w:val="5B6472"/>
           <w:sz w:val="18"/>
         </w:rPr>
-        <w:t>2024 — 2025</w:t>
+        <w:tab/>
+        <w:t>Sep 2024 — Sep 2025</w:t>
       </w:r>
     </w:p>
     <w:p>
       <w:pPr>
-        <w:spacing w:before="0" w:after="40"/>
+        <w:spacing w:after="40"/>
+        <w:ind w:left="227" w:hanging="227"/>
       </w:pPr>
       <w:r>
         <w:rPr>
-          <w:rFonts w:ascii="Segoe UI" w:hAnsi="Segoe UI"/>
           <w:b w:val="0"/>
           <w:i w:val="0"/>
-          <w:color w:val="818CF8"/>
-          <w:sz w:val="18"/>
+          <w:color w:val="4F46E5"/>
+          <w:sz w:val="14"/>
         </w:rPr>
-        <w:t>Ness Technology · Ra'anana, Israel</w:t>
+        <w:t xml:space="preserve">▪  </w:t>
+      </w:r>
+      <w:r>
+        <w:rPr>
+          <w:b/>
+          <w:i w:val="0"/>
+        </w:rPr>
+        <w:t>Shikun &amp; Binui</w:t>
+      </w:r>
+      <w:r>
+        <w:rPr>
+          <w:b w:val="0"/>
+          <w:i w:val="0"/>
+        </w:rPr>
+        <w:t xml:space="preserve"> — stood up production-grade AWS infrastructure from scratch by codifying it end-to-end with Terraform and GitHub Actions CI/CD.</w:t>
       </w:r>
     </w:p>
     <w:p>
       <w:pPr>
-        <w:pStyle w:val="ListBullet"/>
-        <w:spacing w:before="20" w:after="20"/>
-        <w:ind w:left="227"/>
+        <w:spacing w:after="40"/>
+        <w:ind w:left="227" w:hanging="227"/>
       </w:pPr>
       <w:r>
         <w:rPr>
-          <w:rFonts w:ascii="Segoe UI" w:hAnsi="Segoe UI"/>
-          <w:b/>
+          <w:b w:val="0"/>
           <w:i w:val="0"/>
-          <w:color w:val="334155"/>
-          <w:sz w:val="19"/>
+          <w:color w:val="4F46E5"/>
+          <w:sz w:val="14"/>
         </w:rPr>
-        <w:t>Shikun Binui</w:t>
+        <w:t xml:space="preserve">▪  </w:t>
       </w:r>
       <w:r>
         <w:rPr>
-          <w:rFonts w:ascii="Segoe UI" w:hAnsi="Segoe UI"/>
           <w:b w:val="0"/>
           <w:i w:val="0"/>
-          <w:color w:val="334155"/>
-          <w:sz w:val="19"/>
         </w:rPr>
-        <w:t xml:space="preserve"> — Designed cloud architecture from scratch on AWS, provisioned full infrastructure with Terraform and GitHub Actions CI/CD.</w:t>
+        <w:t>Hardened the reliability and security posture of a multi-account AWS Organization by enforcing Service Control Policies (SCP) and IAM least-privilege alongside the security team.</w:t>
       </w:r>
     </w:p>
     <w:p>
       <w:pPr>
-        <w:pStyle w:val="ListBullet"/>
-        <w:spacing w:before="20" w:after="20"/>
-        <w:ind w:left="227"/>
+        <w:spacing w:after="40"/>
+        <w:ind w:left="227" w:hanging="227"/>
       </w:pPr>
       <w:r>
         <w:rPr>
-          <w:rFonts w:ascii="Segoe UI" w:hAnsi="Segoe UI"/>
           <w:b w:val="0"/>
           <w:i w:val="0"/>
-          <w:color w:val="334155"/>
-          <w:sz w:val="19"/>
+          <w:color w:val="4F46E5"/>
+          <w:sz w:val="14"/>
         </w:rPr>
+        <w:t xml:space="preserve">▪  </w:t>
       </w:r>
       <w:r>
         <w:rPr>
-          <w:rFonts w:ascii="Segoe UI" w:hAnsi="Segoe UI"/>
           <w:b w:val="0"/>
           <w:i w:val="0"/>
-          <w:color w:val="334155"/>
-          <w:sz w:val="19"/>
         </w:rPr>
-        <w:t>Managed and enforced AWS Service Control Policies (SCP) across multi-account organization for governance and security.</w:t>
+        <w:t>Improved incident response across environments by building centralized logging and alerting and supporting on-call operations.</w:t>
       </w:r>
     </w:p>
     <w:p>
       <w:pPr>
-        <w:pStyle w:val="ListBullet"/>
-        <w:spacing w:before="20" w:after="20"/>
-        <w:ind w:left="227"/>
-      </w:pPr>
-      <w:r>
-        <w:rPr>
-          <w:rFonts w:ascii="Segoe UI" w:hAnsi="Segoe UI"/>
-          <w:b w:val="0"/>
-          <w:i w:val="0"/>
-          <w:color w:val="334155"/>
-          <w:sz w:val="19"/>
-        </w:rPr>
-      </w:r>
-      <w:r>
-        <w:rPr>
-          <w:rFonts w:ascii="Segoe UI" w:hAnsi="Segoe UI"/>
-          <w:b w:val="0"/>
-          <w:i w:val="0"/>
-          <w:color w:val="334155"/>
-          <w:sz w:val="19"/>
-        </w:rPr>
-        <w:t>Worked closely with Security team to harden infrastructure, implement IAM best practices, and ensure compliance.</w:t>
-      </w:r>
-    </w:p>
-    <w:p>
-      <w:pPr>
-        <w:pStyle w:val="ListBullet"/>
-        <w:spacing w:before="20" w:after="20"/>
-        <w:ind w:left="227"/>
-      </w:pPr>
-      <w:r>
-        <w:rPr>
-          <w:rFonts w:ascii="Segoe UI" w:hAnsi="Segoe UI"/>
-          <w:b w:val="0"/>
-          <w:i w:val="0"/>
-          <w:color w:val="334155"/>
-          <w:sz w:val="19"/>
-        </w:rPr>
-      </w:r>
-      <w:r>
-        <w:rPr>
-          <w:rFonts w:ascii="Segoe UI" w:hAnsi="Segoe UI"/>
-          <w:b w:val="0"/>
-          <w:i w:val="0"/>
-          <w:color w:val="334155"/>
-          <w:sz w:val="19"/>
-        </w:rPr>
-        <w:t>Built reusable Terraform/Terragrunt modules and CI/CD pipelines across Jenkins, GitHub Actions, GitLab CI, Bitbucket, Azure DevOps.</w:t>
-      </w:r>
-    </w:p>
-    <w:p>
-      <w:pPr>
-        <w:pStyle w:val="ListBullet"/>
-        <w:spacing w:before="20" w:after="20"/>
-        <w:ind w:left="227"/>
-      </w:pPr>
-      <w:r>
-        <w:rPr>
-          <w:rFonts w:ascii="Segoe UI" w:hAnsi="Segoe UI"/>
-          <w:b w:val="0"/>
-          <w:i w:val="0"/>
-          <w:color w:val="334155"/>
-          <w:sz w:val="19"/>
-        </w:rPr>
-      </w:r>
-      <w:r>
-        <w:rPr>
-          <w:rFonts w:ascii="Segoe UI" w:hAnsi="Segoe UI"/>
-          <w:b w:val="0"/>
-          <w:i w:val="0"/>
-          <w:color w:val="334155"/>
-          <w:sz w:val="19"/>
-        </w:rPr>
-        <w:t>Managed Kubernetes (EKS/GKE) clusters with ArgoCD GitOps and Helm for zero-downtime deployments.</w:t>
-      </w:r>
-    </w:p>
-    <w:p>
-      <w:pPr>
-        <w:spacing w:before="200" w:after="60"/>
+        <w:spacing w:before="140" w:after="60"/>
         <w:pBdr>
-          <w:bottom w:val="single" w:sz="6" w:space="4" w:color="818CF8"/>
+          <w:bottom w:val="single" w:sz="6" w:space="2" w:color="4f46e5"/>
         </w:pBdr>
       </w:pPr>
       <w:r>
         <w:rPr>
-          <w:rFonts w:ascii="Segoe UI" w:hAnsi="Segoe UI"/>
           <w:b/>
           <w:i w:val="0"/>
-          <w:color w:val="818CF8"/>
-          <w:sz w:val="20"/>
+          <w:color w:val="4F46E5"/>
+          <w:sz w:val="21"/>
         </w:rPr>
         <w:t>PROJECTS</w:t>
       </w:r>
     </w:p>
     <w:p>
       <w:pPr>
-        <w:spacing w:before="100" w:after="20"/>
+        <w:tabs>
+          <w:tab w:pos="10318" w:val="right"/>
+        </w:tabs>
+        <w:spacing w:before="60"/>
       </w:pPr>
       <w:r>
         <w:rPr>
-          <w:rFonts w:ascii="Segoe UI" w:hAnsi="Segoe UI"/>
           <w:b/>
           <w:i w:val="0"/>
-          <w:color w:val="0F172A"/>
           <w:sz w:val="20"/>
         </w:rPr>
         <w:t>Fivory — Habit &amp; Productivity App</w:t>
       </w:r>
       <w:r>
         <w:rPr>
-          <w:rFonts w:ascii="Segoe UI" w:hAnsi="Segoe UI"/>
           <w:b w:val="0"/>
           <w:i w:val="0"/>
-          <w:color w:val="818CF8"/>
-          <w:sz w:val="17"/>
+          <w:color w:val="4F46E5"/>
+          <w:sz w:val="18"/>
         </w:rPr>
-        <w:t xml:space="preserve">  fivory.net</w:t>
+        <w:t xml:space="preserve">   500+ live users · iOS + Android</w:t>
+      </w:r>
+      <w:r>
+        <w:rPr>
+          <w:b w:val="0"/>
+          <w:i w:val="0"/>
+          <w:color w:val="5B6472"/>
+          <w:sz w:val="18"/>
+        </w:rPr>
+        <w:tab/>
+        <w:t>fivory.net</w:t>
       </w:r>
     </w:p>
     <w:p>
       <w:pPr>
-        <w:spacing w:before="0" w:after="40"/>
+        <w:spacing w:after="40"/>
       </w:pPr>
       <w:r>
         <w:rPr>
-          <w:rFonts w:ascii="Segoe UI" w:hAnsi="Segoe UI"/>
           <w:b w:val="0"/>
-          <w:i/>
-          <w:color w:val="818CF8"/>
-          <w:sz w:val="17"/>
+          <w:i w:val="0"/>
+          <w:sz w:val="19"/>
         </w:rPr>
-        <w:t>Flutter · AWS Lambda · API Gateway · DynamoDB · Cognito · S3 · CloudFront · iOS · Android</w:t>
+        <w:t xml:space="preserve">Shipped a </w:t>
+      </w:r>
+      <w:r>
+        <w:rPr>
+          <w:b/>
+          <w:i w:val="0"/>
+          <w:sz w:val="19"/>
+        </w:rPr>
+        <w:t>B2C product</w:t>
+      </w:r>
+      <w:r>
+        <w:rPr>
+          <w:b w:val="0"/>
+          <w:i w:val="0"/>
+          <w:sz w:val="19"/>
+        </w:rPr>
+        <w:t xml:space="preserve"> to 500+ active users as solo founder, on a fully serverless, low-latency AWS backend (Lambda · API Gateway · DynamoDB · Cognito) with IAM least-privilege and global CloudFront CDN delivery.</w:t>
       </w:r>
     </w:p>
     <w:p>
       <w:pPr>
-        <w:spacing w:before="0" w:after="60"/>
+        <w:tabs>
+          <w:tab w:pos="10318" w:val="right"/>
+        </w:tabs>
+        <w:spacing w:before="60"/>
       </w:pPr>
       <w:r>
         <w:rPr>
-          <w:rFonts w:ascii="Segoe UI" w:hAnsi="Segoe UI"/>
+          <w:b/>
+          <w:i w:val="0"/>
+          <w:sz w:val="20"/>
+        </w:rPr>
+        <w:t>Obsid Workout — Training App</w:t>
+      </w:r>
+      <w:r>
+        <w:rPr>
           <w:b w:val="0"/>
           <w:i w:val="0"/>
-          <w:color w:val="334155"/>
-          <w:sz w:val="19"/>
+          <w:color w:val="4F46E5"/>
+          <w:sz w:val="18"/>
         </w:rPr>
-        <w:t>Habit and productivity tracker with 500+ active users on iOS and Android. Serverless AWS backend — built and shipped as a solo founder.</w:t>
+        <w:t xml:space="preserve">   iOS + Android</w:t>
+      </w:r>
+      <w:r>
+        <w:rPr>
+          <w:b w:val="0"/>
+          <w:i w:val="0"/>
+          <w:color w:val="5B6472"/>
+          <w:sz w:val="18"/>
+        </w:rPr>
+        <w:tab/>
+        <w:t>obsid.click</w:t>
       </w:r>
     </w:p>
     <w:p>
       <w:pPr>
-        <w:spacing w:before="100" w:after="20"/>
+        <w:spacing w:after="40"/>
       </w:pPr>
       <w:r>
         <w:rPr>
-          <w:rFonts w:ascii="Segoe UI" w:hAnsi="Segoe UI"/>
-          <w:b/>
-          <w:i w:val="0"/>
-          <w:color w:val="0F172A"/>
-          <w:sz w:val="20"/>
-        </w:rPr>
-        <w:t>Obsid Workout — Push-up Training App</w:t>
-      </w:r>
-      <w:r>
-        <w:rPr>
-          <w:rFonts w:ascii="Segoe UI" w:hAnsi="Segoe UI"/>
           <w:b w:val="0"/>
           <w:i w:val="0"/>
-          <w:color w:val="818CF8"/>
-          <w:sz w:val="17"/>
+          <w:sz w:val="19"/>
         </w:rPr>
-        <w:t xml:space="preserve">  obsid.click</w:t>
+        <w:t>Consumer fitness app with streak tracking and body-progress, delivered on a secure serverless AWS backend with global CDN delivery via CloudFront.</w:t>
       </w:r>
     </w:p>
     <w:p>
       <w:pPr>
-        <w:spacing w:before="0" w:after="40"/>
+        <w:tabs>
+          <w:tab w:pos="10318" w:val="right"/>
+        </w:tabs>
+        <w:spacing w:before="60"/>
       </w:pPr>
       <w:r>
         <w:rPr>
-          <w:rFonts w:ascii="Segoe UI" w:hAnsi="Segoe UI"/>
+          <w:b/>
+          <w:i w:val="0"/>
+          <w:sz w:val="20"/>
+        </w:rPr>
+        <w:t>FlaskPipeline — Production GitOps Pipeline</w:t>
+      </w:r>
+      <w:r>
+        <w:rPr>
           <w:b w:val="0"/>
-          <w:i/>
-          <w:color w:val="818CF8"/>
-          <w:sz w:val="17"/>
+          <w:i w:val="0"/>
+          <w:color w:val="5B6472"/>
+          <w:sz w:val="18"/>
         </w:rPr>
-        <w:t>Flutter · AWS Lambda · API Gateway · DynamoDB · Cognito · S3 · CloudFront · iOS · Android</w:t>
+        <w:tab/>
+        <w:t>github.com/MatveyGuralskiy</w:t>
       </w:r>
     </w:p>
     <w:p>
       <w:pPr>
-        <w:spacing w:before="0" w:after="60"/>
+        <w:spacing w:after="40"/>
       </w:pPr>
       <w:r>
         <w:rPr>
-          <w:rFonts w:ascii="Segoe UI" w:hAnsi="Segoe UI"/>
           <w:b w:val="0"/>
           <w:i w:val="0"/>
-          <w:color w:val="334155"/>
           <w:sz w:val="19"/>
         </w:rPr>
-        <w:t>Push-up training app with custom plans, streak tracking and body progress. Secure serverless AWS backend with global CDN — built solo.</w:t>
+        <w:t>End-to-end GitOps for a Flask app on AWS EKS — Jenkins CI, GitHub Actions CD, ArgoCD, Terraform IaC and a full Prometheus / Grafana observability stack.</w:t>
       </w:r>
     </w:p>
     <w:p>
       <w:pPr>
-        <w:spacing w:before="100" w:after="20"/>
+        <w:tabs>
+          <w:tab w:pos="10318" w:val="right"/>
+        </w:tabs>
+        <w:spacing w:before="60"/>
       </w:pPr>
       <w:r>
         <w:rPr>
-          <w:rFonts w:ascii="Segoe UI" w:hAnsi="Segoe UI"/>
           <w:b/>
           <w:i w:val="0"/>
-          <w:color w:val="0F172A"/>
           <w:sz w:val="20"/>
         </w:rPr>
-        <w:t>FlaskPipeline</w:t>
+        <w:t>DribbleData — Microservices on EKS</w:t>
       </w:r>
       <w:r>
         <w:rPr>
-          <w:rFonts w:ascii="Segoe UI" w:hAnsi="Segoe UI"/>
           <w:b w:val="0"/>
           <w:i w:val="0"/>
-          <w:color w:val="818CF8"/>
-          <w:sz w:val="17"/>
+          <w:color w:val="5B6472"/>
+          <w:sz w:val="18"/>
         </w:rPr>
-        <w:t xml:space="preserve">  github.com/MatveyGuralskiy</w:t>
+        <w:tab/>
+        <w:t>github.com/MatveyGuralskiy</w:t>
       </w:r>
     </w:p>
     <w:p>
       <w:pPr>
-        <w:spacing w:before="0" w:after="40"/>
+        <w:spacing w:after="40"/>
       </w:pPr>
       <w:r>
         <w:rPr>
-          <w:rFonts w:ascii="Segoe UI" w:hAnsi="Segoe UI"/>
           <w:b w:val="0"/>
-          <w:i/>
-          <w:color w:val="818CF8"/>
-          <w:sz w:val="17"/>
+          <w:i w:val="0"/>
+          <w:sz w:val="19"/>
         </w:rPr>
-        <w:t>AWS EKS · Jenkins · GitHub Actions · ArgoCD · Ansible · Terraform · Grafana · Prometheus</w:t>
+        <w:t>Flask microservices on AWS EKS with CI/CD, Trivy security scans, Fluent Bit logging, automated backups and CloudFront CDN.</w:t>
       </w:r>
     </w:p>
     <w:p>
       <w:pPr>
-        <w:spacing w:before="0" w:after="60"/>
+        <w:spacing w:before="140" w:after="60"/>
+        <w:pBdr>
+          <w:bottom w:val="single" w:sz="6" w:space="2" w:color="4f46e5"/>
+        </w:pBdr>
       </w:pPr>
       <w:r>
         <w:rPr>
-          <w:rFonts w:ascii="Segoe UI" w:hAnsi="Segoe UI"/>
-          <w:b w:val="0"/>
+          <w:b/>
           <w:i w:val="0"/>
-          <w:color w:val="334155"/>
-          <w:sz w:val="19"/>
+          <w:color w:val="4F46E5"/>
+          <w:sz w:val="21"/>
         </w:rPr>
-        <w:t>Production-grade GitOps pipeline — CI with Jenkins, CD with GitHub Actions, GitOps with ArgoCD, IaC with Terraform, full observability.</w:t>
+        <w:t>CERTIFICATIONS</w:t>
       </w:r>
     </w:p>
     <w:p>
       <w:pPr>
-        <w:spacing w:before="200" w:after="60"/>
+        <w:spacing w:after="40"/>
+      </w:pPr>
+      <w:r>
+        <w:rPr>
+          <w:b/>
+          <w:i w:val="0"/>
+          <w:color w:val="4F46E5"/>
+          <w:sz w:val="19"/>
+        </w:rPr>
+        <w:t>10× Cloud Certified</w:t>
+      </w:r>
+      <w:r>
+        <w:rPr>
+          <w:b/>
+          <w:i w:val="0"/>
+          <w:sz w:val="19"/>
+        </w:rPr>
+        <w:t xml:space="preserve"> — 5 AWS · 2 GCP (incl. Professional) · Terraform · Linux</w:t>
+      </w:r>
+    </w:p>
+    <w:p>
+      <w:pPr>
+        <w:spacing w:after="40"/>
+      </w:pPr>
+      <w:r>
+        <w:rPr>
+          <w:b w:val="0"/>
+          <w:i w:val="0"/>
+          <w:sz w:val="19"/>
+        </w:rPr>
+        <w:t>AWS Solutions Architect — Professional   •   AWS DevOps Engineer — Professional   •   AWS Solutions Architect — Associate   •   AWS Developer — Associate   •   AWS SysOps Administrator — Associate   •   GCP Cloud Architect — Professional   •   GCP Cloud DevOps Engineer — Professional   •   HashiCorp Terraform Associate (003)   •   LPI Linux Essentials   •   LPIC-1 (Linux Administrator)</w:t>
+      </w:r>
+    </w:p>
+    <w:p>
+      <w:pPr>
+        <w:spacing w:before="140" w:after="60"/>
         <w:pBdr>
-          <w:bottom w:val="single" w:sz="6" w:space="4" w:color="818CF8"/>
+          <w:bottom w:val="single" w:sz="6" w:space="2" w:color="4f46e5"/>
         </w:pBdr>
       </w:pPr>
       <w:r>
         <w:rPr>
-          <w:rFonts w:ascii="Segoe UI" w:hAnsi="Segoe UI"/>
           <w:b/>
           <w:i w:val="0"/>
-          <w:color w:val="818CF8"/>
-          <w:sz w:val="20"/>
+          <w:color w:val="4F46E5"/>
+          <w:sz w:val="21"/>
         </w:rPr>
         <w:t>EDUCATION</w:t>
       </w:r>
     </w:p>
     <w:p>
       <w:pPr>
-        <w:spacing w:before="80" w:after="20"/>
+        <w:tabs>
+          <w:tab w:pos="10318" w:val="right"/>
+        </w:tabs>
       </w:pPr>
       <w:r>
         <w:rPr>
-          <w:rFonts w:ascii="Segoe UI" w:hAnsi="Segoe UI"/>
+          <w:b/>
+          <w:i w:val="0"/>
+          <w:sz w:val="19"/>
+        </w:rPr>
+        <w:t>AWS Cloud Architect &amp; DevOps</w:t>
+      </w:r>
+      <w:r>
+        <w:rPr>
           <w:b w:val="0"/>
           <w:i w:val="0"/>
-          <w:color w:val="334155"/>
+          <w:color w:val="5B6472"/>
           <w:sz w:val="19"/>
         </w:rPr>
-        <w:t>AWS Cloud Architect &amp; DevOps  ·  Kernelios, Rishon LeZion  ·  Mar 2024 — Aug 2024</w:t>
+        <w:t xml:space="preserve">  ·  Kernelios · Rishon LeZion, Israel</w:t>
+      </w:r>
+      <w:r>
+        <w:rPr>
+          <w:b w:val="0"/>
+          <w:i w:val="0"/>
+          <w:color w:val="5B6472"/>
+          <w:sz w:val="18"/>
+        </w:rPr>
+        <w:tab/>
+        <w:t>Mar — Aug 2024</w:t>
       </w:r>
     </w:p>
     <w:p>
       <w:pPr>
-        <w:spacing w:before="200" w:after="60"/>
+        <w:spacing w:before="140" w:after="60"/>
         <w:pBdr>
-          <w:bottom w:val="single" w:sz="6" w:space="4" w:color="818CF8"/>
+          <w:bottom w:val="single" w:sz="6" w:space="2" w:color="4f46e5"/>
         </w:pBdr>
       </w:pPr>
       <w:r>
         <w:rPr>
-          <w:rFonts w:ascii="Segoe UI" w:hAnsi="Segoe UI"/>
           <w:b/>
           <w:i w:val="0"/>
-          <w:color w:val="818CF8"/>
-          <w:sz w:val="20"/>
+          <w:color w:val="4F46E5"/>
+          <w:sz w:val="21"/>
         </w:rPr>
         <w:t>MILITARY SERVICE</w:t>
       </w:r>
     </w:p>
     <w:p>
       <w:pPr>
-        <w:spacing w:before="80" w:after="20"/>
+        <w:tabs>
+          <w:tab w:pos="10318" w:val="right"/>
+        </w:tabs>
       </w:pPr>
       <w:r>
         <w:rPr>
-          <w:rFonts w:ascii="Segoe UI" w:hAnsi="Segoe UI"/>
+          <w:b/>
+          <w:i w:val="0"/>
+          <w:sz w:val="19"/>
+        </w:rPr>
+        <w:t>Border Police (MAGAV)</w:t>
+      </w:r>
+      <w:r>
+        <w:rPr>
           <w:b w:val="0"/>
           <w:i w:val="0"/>
-          <w:color w:val="334155"/>
+          <w:color w:val="5B6472"/>
           <w:sz w:val="19"/>
         </w:rPr>
-        <w:t>Border Police (MAGAV)  ·  2020 — 2023  ·  Recognized for excellence by Brigade Commander</w:t>
+        <w:t xml:space="preserve">  ·  Recognized for excellence by Brigade Commander</w:t>
+      </w:r>
+      <w:r>
+        <w:rPr>
+          <w:b w:val="0"/>
+          <w:i w:val="0"/>
+          <w:color w:val="5B6472"/>
+          <w:sz w:val="18"/>
+        </w:rPr>
+        <w:tab/>
+        <w:t>2020 — 2023</w:t>
       </w:r>
     </w:p>
     <w:p>
       <w:pPr>
-        <w:spacing w:before="200" w:after="60"/>
+        <w:spacing w:before="140" w:after="60"/>
         <w:pBdr>
-          <w:bottom w:val="single" w:sz="6" w:space="4" w:color="818CF8"/>
+          <w:bottom w:val="single" w:sz="6" w:space="2" w:color="4f46e5"/>
         </w:pBdr>
       </w:pPr>
       <w:r>
         <w:rPr>
-          <w:rFonts w:ascii="Segoe UI" w:hAnsi="Segoe UI"/>
           <w:b/>
           <w:i w:val="0"/>
-          <w:color w:val="818CF8"/>
-          <w:sz w:val="20"/>
-        </w:rPr>
-        <w:t>CERTIFICATIONS</w:t>
-      </w:r>
-    </w:p>
-    <w:p>
-      <w:pPr>
-        <w:spacing w:before="60" w:after="20"/>
-      </w:pPr>
-      <w:r>
-        <w:rPr>
-          <w:rFonts w:ascii="Segoe UI" w:hAnsi="Segoe UI"/>
-          <w:b w:val="0"/>
-          <w:i w:val="0"/>
-          <w:color w:val="334155"/>
-          <w:sz w:val="18"/>
-        </w:rPr>
-        <w:t>AWS Solutions Architect Professional  ·  AWS DevOps Professional  ·  AWS Solutions Architect Associate  ·  AWS Developer Associate  ·  AWS SysOps Administrator Associate  ·  GCP Cloud Architect Professional  ·  GCP Cloud DevOps Professional  ·  HashiCorp Terraform Associate 003  ·  LPI Linux Essentials + LPIC-1</w:t>
-      </w:r>
-    </w:p>
-    <w:p>
-      <w:pPr>
-        <w:spacing w:before="200" w:after="60"/>
-        <w:pBdr>
-          <w:bottom w:val="single" w:sz="6" w:space="4" w:color="818CF8"/>
-        </w:pBdr>
-      </w:pPr>
-      <w:r>
-        <w:rPr>
-          <w:rFonts w:ascii="Segoe UI" w:hAnsi="Segoe UI"/>
-          <w:b/>
-          <w:i w:val="0"/>
-          <w:color w:val="818CF8"/>
-          <w:sz w:val="20"/>
+          <w:color w:val="4F46E5"/>
+          <w:sz w:val="21"/>
         </w:rPr>
         <w:t>LANGUAGES</w:t>
       </w:r>
     </w:p>
     <w:p>
-      <w:pPr>
-        <w:spacing w:before="60" w:after="20"/>
-      </w:pPr>
       <w:r>
         <w:rPr>
-          <w:rFonts w:ascii="Segoe UI" w:hAnsi="Segoe UI"/>
+          <w:b/>
+          <w:i w:val="0"/>
+          <w:sz w:val="19"/>
+        </w:rPr>
+        <w:t>English</w:t>
+      </w:r>
+      <w:r>
+        <w:rPr>
           <w:b w:val="0"/>
           <w:i w:val="0"/>
-          <w:color w:val="334155"/>
           <w:sz w:val="19"/>
         </w:rPr>
-        <w:t>English: Proficient  ·  Hebrew: Native-level  ·  Russian: Native</w:t>
+        <w:t xml:space="preserve"> — Proficient    ·    </w:t>
+      </w:r>
+      <w:r>
+        <w:rPr>
+          <w:b/>
+          <w:i w:val="0"/>
+          <w:sz w:val="19"/>
+        </w:rPr>
+        <w:t>Hebrew</w:t>
+      </w:r>
+      <w:r>
+        <w:rPr>
+          <w:b w:val="0"/>
+          <w:i w:val="0"/>
+          <w:sz w:val="19"/>
+        </w:rPr>
+        <w:t xml:space="preserve"> — Near-Native    ·    </w:t>
+      </w:r>
+      <w:r>
+        <w:rPr>
+          <w:b/>
+          <w:i w:val="0"/>
+          <w:sz w:val="19"/>
+        </w:rPr>
+        <w:t>Russian</w:t>
+      </w:r>
+      <w:r>
+        <w:rPr>
+          <w:b w:val="0"/>
+          <w:i w:val="0"/>
+          <w:sz w:val="19"/>
+        </w:rPr>
+        <w:t xml:space="preserve"> — Native</w:t>
       </w:r>
     </w:p>
     <w:sectPr>
-      <w:pgSz w:w="12240" w:h="15840"/>
-      <w:pgMar w:top="850" w:right="1020" w:bottom="850" w:left="1020" w:header="720" w:footer="720" w:gutter="0"/>
+      <w:pgSz w:w="11906" w:h="16838"/>
+      <w:pgMar w:top="680" w:right="794" w:bottom="567" w:left="794" w:header="720" w:footer="720" w:gutter="0"/>
       <w:cols w:space="720"/>
       <w:docGrid w:linePitch="360"/>
     </w:sectPr>
@@ -1382,6 +1464,14 @@
     <w:name w:val="Normal"/>
     <w:qFormat/>
     <w:rsid w:val="00FC693F"/>
+    <w:pPr>
+      <w:spacing w:after="0" w:before="0" w:line="245" w:lineRule="auto"/>
+    </w:pPr>
+    <w:rPr>
+      <w:rFonts w:ascii="Calibri" w:hAnsi="Calibri"/>
+      <w:color w:val="12151C"/>
+      <w:sz w:val="20"/>
+    </w:rPr>
   </w:style>
   <w:style w:type="paragraph" w:styleId="Header">
     <w:name w:val="header"/>

</xml_diff>

<commit_message>
Add CKA to resume documents (EN + HE): DOCX, PDF and preview images
- Insert "CNCF Certified Kubernetes Administrator (CKA)" into the certifications
  list and summary of both English and Hebrew resumes; bump 10 -> 11
- Regenerate PDFs (LibreOffice) and PNG previews to match
- Remove the CKA entry from the resume career timeline (that section is jobs only)

Co-Authored-By: Claude Opus 4.8 <noreply@anthropic.com>
</commit_message>
<xml_diff>
--- a/PDF/resume-eng.docx
+++ b/PDF/resume-eng.docx
@@ -155,7 +155,7 @@
           <w:i w:val="0"/>
           <w:sz w:val="19"/>
         </w:rPr>
-        <w:t>10 cloud certifications</w:t>
+        <w:t>11 certifications</w:t>
       </w:r>
       <w:r>
         <w:rPr>
@@ -898,7 +898,7 @@
           <w:color w:val="4F46E5"/>
           <w:sz w:val="19"/>
         </w:rPr>
-        <w:t>10× Cloud Certified</w:t>
+        <w:t>11× Certified</w:t>
       </w:r>
       <w:r>
         <w:rPr>
@@ -906,7 +906,7 @@
           <w:i w:val="0"/>
           <w:sz w:val="19"/>
         </w:rPr>
-        <w:t xml:space="preserve"> — 5 AWS · 2 GCP (incl. Professional) · Terraform · Linux</w:t>
+        <w:t xml:space="preserve"> — 5 AWS · 2 GCP (incl. Professional) · Kubernetes (CKA) · Terraform · Linux</w:t>
       </w:r>
     </w:p>
     <w:p>
@@ -919,7 +919,7 @@
           <w:i w:val="0"/>
           <w:sz w:val="19"/>
         </w:rPr>
-        <w:t>AWS Solutions Architect — Professional   •   AWS DevOps Engineer — Professional   •   AWS Solutions Architect — Associate   •   AWS Developer — Associate   •   AWS SysOps Administrator — Associate   •   GCP Cloud Architect — Professional   •   GCP Cloud DevOps Engineer — Professional   •   HashiCorp Terraform Associate (003)   •   LPI Linux Essentials   •   LPIC-1 (Linux Administrator)</w:t>
+        <w:t>CNCF Certified Kubernetes Administrator (CKA)   •   AWS Solutions Architect — Professional   •   AWS DevOps Engineer — Professional   •   AWS Solutions Architect — Associate   •   AWS Developer — Associate   •   AWS SysOps Administrator — Associate   •   GCP Cloud Architect — Professional   •   GCP Cloud DevOps Engineer — Professional   •   HashiCorp Terraform Associate (003)   •   LPI Linux Essentials   •   LPIC-1 (Linux Administrator)</w:t>
       </w:r>
     </w:p>
     <w:p>

</xml_diff>

<commit_message>
Resume: show year-only dates (drop months) across EN + HE, PDF/PNG/DOCX
Co-Authored-By: Claude Opus 4.8 <noreply@anthropic.com>
</commit_message>
<xml_diff>
--- a/PDF/resume-eng.docx
+++ b/PDF/resume-eng.docx
@@ -408,7 +408,7 @@
           <w:sz w:val="18"/>
         </w:rPr>
         <w:tab/>
-        <w:t>Sep 2025 — Present</w:t>
+        <w:t>2025 — Present</w:t>
       </w:r>
     </w:p>
     <w:p>
@@ -587,7 +587,7 @@
           <w:sz w:val="18"/>
         </w:rPr>
         <w:tab/>
-        <w:t>Sep 2024 — Sep 2025</w:t>
+        <w:t>2024 — 2025</w:t>
       </w:r>
     </w:p>
     <w:p>
@@ -970,7 +970,7 @@
           <w:sz w:val="18"/>
         </w:rPr>
         <w:tab/>
-        <w:t>Mar — Aug 2024</w:t>
+        <w:t>2024</w:t>
       </w:r>
     </w:p>
     <w:p>

</xml_diff>